<commit_message>
Walkthrough: confirm WTS rates and request process from WTS pages
Rates checked on the WTS Virtual Server Hosting catalogue page; adds
what the price includes, the named system administrator requirement,
maintenance windows, the request route (Jira ticket to WTS System
Administration) and why 20 GB of storage is enough.

Co-Authored-By: Claude Opus 5.5 <noreply@anthropic.com>
Claude-Session: https://claude.ai/code/session_01WvzECS9tkcDkGpWoZeB54Z
</commit_message>
<xml_diff>
--- a/docs/CTS_GitHub_Server_Walkthrough.docx
+++ b/docs/CTS_GitHub_Server_Walkthrough.docx
@@ -1020,7 +1020,7 @@
     <w:p>
       <w:r>
         <w:rPr/>
-        <w:t xml:space="preserve">WTS lists its </w:t>
+        <w:t xml:space="preserve">WTS lists these rates on its </w:t>
       </w:r>
       <w:hyperlink r:id="rId14" w:history="1">
         <w:r>
@@ -1032,7 +1032,61 @@
       </w:hyperlink>
       <w:r>
         <w:rPr/>
-        <w:t xml:space="preserve"> rates for internal (Western) customers as a $40 base, plus $3 per shared CPU core ($24 per dedicated core), $4 per GB of RAM and $0.10 per GB of storage. A small shared server (2 cores, 4 GB RAM, 20 GB storage) therefore comes to about $64, which the </w:t>
+        <w:t xml:space="preserve"> catalogue page (checked October 2026):</w:t>
+      </w:r>
+    </w:p>
+    <w:p>
+      <w:pPr>
+        <w:pStyle w:val="ListParagraph"/>
+        <w:numPr>
+          <w:ilvl w:val="0"/>
+          <w:numId w:val="120"/>
+        </w:numPr>
+      </w:pPr>
+      <w:r>
+        <w:rPr>
+          <w:b/>
+        </w:rPr>
+        <w:t xml:space="preserve">Internal (Western), shared:</w:t>
+      </w:r>
+      <w:r>
+        <w:rPr/>
+        <w:t xml:space="preserve"> $40 base VM, $3 per CPU core, $4 per GB of RAM, $0.10 per GB of storage</w:t>
+      </w:r>
+    </w:p>
+    <w:p>
+      <w:pPr>
+        <w:pStyle w:val="ListParagraph"/>
+        <w:numPr>
+          <w:ilvl w:val="0"/>
+          <w:numId w:val="120"/>
+        </w:numPr>
+      </w:pPr>
+      <w:r>
+        <w:rPr>
+          <w:b/>
+        </w:rPr>
+        <w:t xml:space="preserve">Internal, dedicated:</w:t>
+      </w:r>
+      <w:r>
+        <w:rPr/>
+        <w:t xml:space="preserve"> $40 base VM, $24 per CPU core, with the same RAM and storage rates</w:t>
+      </w:r>
+    </w:p>
+    <w:p>
+      <w:r>
+        <w:rPr/>
+        <w:t xml:space="preserve">A shared server with 2 cores, 4 GB RAM and 20 GB storage comes to $40 + $6 + $16 + $2 = </w:t>
+      </w:r>
+      <w:r>
+        <w:rPr>
+          <w:b/>
+        </w:rPr>
+        <w:t xml:space="preserve">$64</w:t>
+      </w:r>
+      <w:r>
+        <w:rPr/>
+        <w:t xml:space="preserve">. The page does not state the billing period; the </w:t>
       </w:r>
       <w:r>
         <w:rPr>
@@ -1042,27 +1096,118 @@
       </w:r>
       <w:r>
         <w:rPr/>
-        <w:t xml:space="preserve"> lists as a monthly cost. WTS points to its WTS Services Document for current rates, so confirm the price, billing period and specs in the request.</w:t>
-      </w:r>
-    </w:p>
-    <w:p>
-      <w:r>
-        <w:rPr/>
-        <w:t xml:space="preserve">Request the server through a WTS Helpdesk ticket, and raise these points:</w:t>
-      </w:r>
-    </w:p>
-    <w:p>
-      <w:pPr>
-        <w:pStyle w:val="ListParagraph"/>
-        <w:numPr>
-          <w:ilvl w:val="0"/>
-          <w:numId w:val="120"/>
+        <w:t xml:space="preserve"> treats it as monthly, and WTS's </w:t>
+      </w:r>
+      <w:hyperlink r:id="rId15" w:history="1">
+        <w:r>
+          <w:rPr>
+            <w:rStyle w:val="Hyperlink"/>
+          </w:rPr>
+          <w:t xml:space="preserve">hosting page</w:t>
+        </w:r>
+      </w:hyperlink>
+      <w:r>
+        <w:rPr/>
+        <w:t xml:space="preserve"> points to the WTS Services Document for current pricing, so confirm the period in the request.</w:t>
+      </w:r>
+    </w:p>
+    <w:p>
+      <w:r>
+        <w:rPr/>
+        <w:t xml:space="preserve">The specs are sized for the application, not for study data, which is stored in REDCap rather than on the server. The application needs about 1 GB of disk (code, dependencies and build); the rest of the 20 GB leaves room for the operating system, updates and logs. Storage costs $0.10 per GB, so the difference between 10 GB and 20 GB is about $1.</w:t>
+      </w:r>
+    </w:p>
+    <w:p>
+      <w:r>
+        <w:rPr/>
+        <w:t xml:space="preserve">According to WTS, the price includes operating system licensing, backup of the operating system and data files, and the initial operating system setup. Note that:</w:t>
+      </w:r>
+    </w:p>
+    <w:p>
+      <w:pPr>
+        <w:pStyle w:val="ListParagraph"/>
+        <w:numPr>
+          <w:ilvl w:val="0"/>
+          <w:numId w:val="122"/>
         </w:numPr>
       </w:pPr>
       <w:r>
         <w:rPr>
           <w:b/>
         </w:rPr>
+        <w:t xml:space="preserve">A system administrator must be named</w:t>
+      </w:r>
+      <w:r>
+        <w:rPr/>
+        <w:t xml:space="preserve"> for the server. That person handles patching and user access, as for a physical server, unless WTS is paid to take on the role (priced in the WTS Services Document)</w:t>
+      </w:r>
+    </w:p>
+    <w:p>
+      <w:pPr>
+        <w:pStyle w:val="ListParagraph"/>
+        <w:numPr>
+          <w:ilvl w:val="0"/>
+          <w:numId w:val="122"/>
+        </w:numPr>
+      </w:pPr>
+      <w:r>
+        <w:rPr>
+          <w:b/>
+        </w:rPr>
+        <w:t xml:space="preserve">The request also needs</w:t>
+      </w:r>
+      <w:r>
+        <w:rPr/>
+        <w:t xml:space="preserve"> a designated application and data administrator, and a description of how the server will be used, for WTS's security evaluation</w:t>
+      </w:r>
+    </w:p>
+    <w:p>
+      <w:pPr>
+        <w:pStyle w:val="ListParagraph"/>
+        <w:numPr>
+          <w:ilvl w:val="0"/>
+          <w:numId w:val="122"/>
+        </w:numPr>
+      </w:pPr>
+      <w:r>
+        <w:rPr>
+          <w:b/>
+        </w:rPr>
+        <w:t xml:space="preserve">Maintenance windows</w:t>
+      </w:r>
+      <w:r>
+        <w:rPr/>
+        <w:t xml:space="preserve"> are Sundays 12 am – 10 am and Thursdays 12 am – 7 am ET. The survey may be unavailable then, so avoid scheduling invitation emails in those windows</w:t>
+      </w:r>
+    </w:p>
+    <w:p>
+      <w:r>
+        <w:rPr/>
+        <w:t xml:space="preserve">Request the server through a Jira ticket to </w:t>
+      </w:r>
+      <w:r>
+        <w:rPr>
+          <w:b/>
+        </w:rPr>
+        <w:t xml:space="preserve">WTS System Administration</w:t>
+      </w:r>
+      <w:r>
+        <w:rPr/>
+        <w:t xml:space="preserve"> (linked from the catalogue page), and include these points:</w:t>
+      </w:r>
+    </w:p>
+    <w:p>
+      <w:pPr>
+        <w:pStyle w:val="ListParagraph"/>
+        <w:numPr>
+          <w:ilvl w:val="0"/>
+          <w:numId w:val="124"/>
+        </w:numPr>
+      </w:pPr>
+      <w:r>
+        <w:rPr>
+          <w:b/>
+        </w:rPr>
         <w:t xml:space="preserve">A Linux VM</w:t>
       </w:r>
       <w:r>
@@ -1075,7 +1220,7 @@
         <w:pStyle w:val="ListParagraph"/>
         <w:numPr>
           <w:ilvl w:val="0"/>
-          <w:numId w:val="120"/>
+          <w:numId w:val="124"/>
         </w:numPr>
       </w:pPr>
       <w:r>
@@ -1117,7 +1262,7 @@
         <w:pStyle w:val="ListParagraph"/>
         <w:numPr>
           <w:ilvl w:val="0"/>
-          <w:numId w:val="120"/>
+          <w:numId w:val="124"/>
         </w:numPr>
       </w:pPr>
       <w:r>
@@ -1136,7 +1281,7 @@
         <w:pStyle w:val="ListParagraph"/>
         <w:numPr>
           <w:ilvl w:val="0"/>
-          <w:numId w:val="120"/>
+          <w:numId w:val="124"/>
         </w:numPr>
       </w:pPr>
       <w:r>
@@ -1155,7 +1300,7 @@
         <w:pStyle w:val="ListParagraph"/>
         <w:numPr>
           <w:ilvl w:val="0"/>
-          <w:numId w:val="120"/>
+          <w:numId w:val="124"/>
         </w:numPr>
       </w:pPr>
       <w:r>
@@ -1174,7 +1319,7 @@
         <w:pStyle w:val="ListParagraph"/>
         <w:numPr>
           <w:ilvl w:val="0"/>
-          <w:numId w:val="120"/>
+          <w:numId w:val="124"/>
         </w:numPr>
       </w:pPr>
       <w:r>
@@ -1206,37 +1351,245 @@
         <w:pStyle w:val="ListParagraph"/>
         <w:numPr>
           <w:ilvl w:val="0"/>
-          <w:numId w:val="120"/>
+          <w:numId w:val="124"/>
         </w:numPr>
       </w:pPr>
       <w:r>
         <w:rPr>
           <w:b/>
         </w:rPr>
-        <w:t xml:space="preserve">Who patches the operating system and who has administrator access</w:t>
-      </w:r>
-      <w:r>
-        <w:rPr/>
-        <w:t xml:space="preserve">, for the REB application</w:t>
-      </w:r>
-    </w:p>
-    <w:p>
-      <w:pPr>
-        <w:pStyle w:val="ListParagraph"/>
-        <w:numPr>
-          <w:ilvl w:val="0"/>
-          <w:numId w:val="120"/>
+        <w:t xml:space="preserve">SSH access for the administrator</w:t>
+      </w:r>
+      <w:r>
+        <w:rPr/>
+        <w:t xml:space="preserve"> (for example over the VPN), to install and update the application</w:t>
+      </w:r>
+    </w:p>
+    <w:p>
+      <w:pPr>
+        <w:pStyle w:val="Heading3"/>
+      </w:pPr>
+      <w:r>
+        <w:t>3.2 Code changes before deploying</w:t>
+      </w:r>
+    </w:p>
+    <w:p>
+      <w:r>
+        <w:rPr/>
+        <w:t xml:space="preserve">The REDCap functions in </w:t>
+      </w:r>
+      <w:r>
+        <w:rPr>
+          <w:rFonts w:ascii="Consolas" w:hAnsi="Consolas" w:cs="Consolas"/>
+          <w:color w:val="333333"/>
+          <w:sz w:val="19"/>
+          <w:szCs w:val="19"/>
+        </w:rPr>
+        <w:t xml:space="preserve">functions/api/</w:t>
+      </w:r>
+      <w:r>
+        <w:rPr/>
+        <w:t xml:space="preserve"> are written for Cloudflare Pages Functions. They use only standard web features (fetch, FormData, Web Crypto, Request/Response), so they move to Node.js with little change. Still to be built:</w:t>
+      </w:r>
+    </w:p>
+    <w:p>
+      <w:pPr>
+        <w:pStyle w:val="ListParagraph"/>
+        <w:numPr>
+          <w:ilvl w:val="0"/>
+          <w:numId w:val="127"/>
         </w:numPr>
       </w:pPr>
       <w:r>
         <w:rPr>
           <w:b/>
         </w:rPr>
-        <w:t xml:space="preserve">SSH access for the maintainer</w:t>
-      </w:r>
-      <w:r>
-        <w:rPr/>
-        <w:t xml:space="preserve"> (for example over the VPN), to install and update the application</w:t>
+        <w:t xml:space="preserve">A small Node.js server</w:t>
+      </w:r>
+      <w:r>
+        <w:rPr/>
+        <w:t xml:space="preserve"> (for example </w:t>
+      </w:r>
+      <w:r>
+        <w:rPr>
+          <w:rFonts w:ascii="Consolas" w:hAnsi="Consolas" w:cs="Consolas"/>
+          <w:color w:val="333333"/>
+          <w:sz w:val="19"/>
+          <w:szCs w:val="19"/>
+        </w:rPr>
+        <w:t xml:space="preserve">server/index.mjs</w:t>
+      </w:r>
+      <w:r>
+        <w:rPr/>
+        <w:t xml:space="preserve">) that serves the built site from </w:t>
+      </w:r>
+      <w:r>
+        <w:rPr>
+          <w:rFonts w:ascii="Consolas" w:hAnsi="Consolas" w:cs="Consolas"/>
+          <w:color w:val="333333"/>
+          <w:sz w:val="19"/>
+          <w:szCs w:val="19"/>
+        </w:rPr>
+        <w:t xml:space="preserve">out/</w:t>
+      </w:r>
+      <w:r>
+        <w:rPr/>
+        <w:t xml:space="preserve"> and routes </w:t>
+      </w:r>
+      <w:r>
+        <w:rPr>
+          <w:rFonts w:ascii="Consolas" w:hAnsi="Consolas" w:cs="Consolas"/>
+          <w:color w:val="333333"/>
+          <w:sz w:val="19"/>
+          <w:szCs w:val="19"/>
+        </w:rPr>
+        <w:t xml:space="preserve">/api/redcap/session</w:t>
+      </w:r>
+      <w:r>
+        <w:rPr/>
+        <w:t xml:space="preserve">, </w:t>
+      </w:r>
+      <w:r>
+        <w:rPr>
+          <w:rFonts w:ascii="Consolas" w:hAnsi="Consolas" w:cs="Consolas"/>
+          <w:color w:val="333333"/>
+          <w:sz w:val="19"/>
+          <w:szCs w:val="19"/>
+        </w:rPr>
+        <w:t xml:space="preserve">/api/redcap/submit</w:t>
+      </w:r>
+      <w:r>
+        <w:rPr/>
+        <w:t xml:space="preserve"> and </w:t>
+      </w:r>
+      <w:r>
+        <w:rPr>
+          <w:rFonts w:ascii="Consolas" w:hAnsi="Consolas" w:cs="Consolas"/>
+          <w:color w:val="333333"/>
+          <w:sz w:val="19"/>
+          <w:szCs w:val="19"/>
+        </w:rPr>
+        <w:t xml:space="preserve">/api/redcap/provision</w:t>
+      </w:r>
+      <w:r>
+        <w:rPr/>
+        <w:t xml:space="preserve"> to the existing handlers, passing the environment variables as </w:t>
+      </w:r>
+      <w:r>
+        <w:rPr>
+          <w:rFonts w:ascii="Consolas" w:hAnsi="Consolas" w:cs="Consolas"/>
+          <w:color w:val="333333"/>
+          <w:sz w:val="19"/>
+          <w:szCs w:val="19"/>
+        </w:rPr>
+        <w:t xml:space="preserve">env</w:t>
+      </w:r>
+      <w:r>
+        <w:rPr/>
+        <w:t xml:space="preserve">. A framework that uses the same Request/Response style, such as Hono with its Node adapter, keeps this to a few lines</w:t>
+      </w:r>
+    </w:p>
+    <w:p>
+      <w:pPr>
+        <w:pStyle w:val="ListParagraph"/>
+        <w:numPr>
+          <w:ilvl w:val="0"/>
+          <w:numId w:val="127"/>
+        </w:numPr>
+      </w:pPr>
+      <w:r>
+        <w:rPr>
+          <w:b/>
+        </w:rPr>
+        <w:t xml:space="preserve">Security headers.</w:t>
+      </w:r>
+      <w:r>
+        <w:rPr/>
+        <w:t xml:space="preserve"> </w:t>
+      </w:r>
+      <w:r>
+        <w:rPr>
+          <w:rFonts w:ascii="Consolas" w:hAnsi="Consolas" w:cs="Consolas"/>
+          <w:color w:val="333333"/>
+          <w:sz w:val="19"/>
+          <w:szCs w:val="19"/>
+        </w:rPr>
+        <w:t xml:space="preserve">public/_headers</w:t>
+      </w:r>
+      <w:r>
+        <w:rPr/>
+        <w:t xml:space="preserve"> is a Cloudflare-specific file; set the same headers in the server or the reverse proxy</w:t>
+      </w:r>
+    </w:p>
+    <w:p>
+      <w:pPr>
+        <w:pStyle w:val="ListParagraph"/>
+        <w:numPr>
+          <w:ilvl w:val="0"/>
+          <w:numId w:val="127"/>
+        </w:numPr>
+      </w:pPr>
+      <w:r>
+        <w:rPr>
+          <w:b/>
+        </w:rPr>
+        <w:t xml:space="preserve">A start script</w:t>
+      </w:r>
+      <w:r>
+        <w:rPr/>
+        <w:t xml:space="preserve"> in </w:t>
+      </w:r>
+      <w:r>
+        <w:rPr>
+          <w:rFonts w:ascii="Consolas" w:hAnsi="Consolas" w:cs="Consolas"/>
+          <w:color w:val="333333"/>
+          <w:sz w:val="19"/>
+          <w:szCs w:val="19"/>
+        </w:rPr>
+        <w:t xml:space="preserve">package.json</w:t>
+      </w:r>
+      <w:r>
+        <w:rPr/>
+        <w:t xml:space="preserve"> (for example </w:t>
+      </w:r>
+      <w:r>
+        <w:rPr>
+          <w:rFonts w:ascii="Consolas" w:hAnsi="Consolas" w:cs="Consolas"/>
+          <w:color w:val="333333"/>
+          <w:sz w:val="19"/>
+          <w:szCs w:val="19"/>
+        </w:rPr>
+        <w:t xml:space="preserve">"start:server": "node server/index.mjs"</w:t>
+      </w:r>
+      <w:r>
+        <w:rPr/>
+        <w:t xml:space="preserve">)</w:t>
+      </w:r>
+    </w:p>
+    <w:p>
+      <w:pPr>
+        <w:pStyle w:val="ListParagraph"/>
+        <w:numPr>
+          <w:ilvl w:val="0"/>
+          <w:numId w:val="127"/>
+        </w:numPr>
+      </w:pPr>
+      <w:r>
+        <w:rPr/>
+        <w:t xml:space="preserve">Keep the site and the API on the same address, so the session cookie and the </w:t>
+      </w:r>
+      <w:r>
+        <w:rPr>
+          <w:rFonts w:ascii="Consolas" w:hAnsi="Consolas" w:cs="Consolas"/>
+          <w:color w:val="333333"/>
+          <w:sz w:val="19"/>
+          <w:szCs w:val="19"/>
+        </w:rPr>
+        <w:t xml:space="preserve">?k=</w:t>
+      </w:r>
+      <w:r>
+        <w:rPr/>
+        <w:t xml:space="preserve"> links work unchanged (Overview, Section 7.3)</w:t>
       </w:r>
     </w:p>
     <w:p>
@@ -1244,93 +1597,68 @@
         <w:pStyle w:val="Heading3"/>
       </w:pPr>
       <w:r>
-        <w:t>3.2 Code changes before deploying</w:t>
-      </w:r>
-    </w:p>
-    <w:p>
-      <w:r>
-        <w:rPr/>
-        <w:t xml:space="preserve">The REDCap functions in </w:t>
-      </w:r>
-      <w:r>
-        <w:rPr>
-          <w:rFonts w:ascii="Consolas" w:hAnsi="Consolas" w:cs="Consolas"/>
-          <w:color w:val="333333"/>
-          <w:sz w:val="19"/>
-          <w:szCs w:val="19"/>
-        </w:rPr>
-        <w:t xml:space="preserve">functions/api/</w:t>
-      </w:r>
-      <w:r>
-        <w:rPr/>
-        <w:t xml:space="preserve"> are written for Cloudflare Pages Functions. They use only standard web features (fetch, FormData, Web Crypto, Request/Response), so they move to Node.js with little change. Still to be built:</w:t>
-      </w:r>
-    </w:p>
-    <w:p>
-      <w:pPr>
-        <w:pStyle w:val="ListParagraph"/>
-        <w:numPr>
-          <w:ilvl w:val="0"/>
-          <w:numId w:val="123"/>
-        </w:numPr>
-      </w:pPr>
-      <w:r>
-        <w:rPr>
-          <w:b/>
-        </w:rPr>
-        <w:t xml:space="preserve">A small Node.js server</w:t>
-      </w:r>
-      <w:r>
-        <w:rPr/>
-        <w:t xml:space="preserve"> (for example </w:t>
-      </w:r>
-      <w:r>
-        <w:rPr>
-          <w:rFonts w:ascii="Consolas" w:hAnsi="Consolas" w:cs="Consolas"/>
-          <w:color w:val="333333"/>
-          <w:sz w:val="19"/>
-          <w:szCs w:val="19"/>
-        </w:rPr>
-        <w:t xml:space="preserve">server/index.mjs</w:t>
-      </w:r>
-      <w:r>
-        <w:rPr/>
-        <w:t xml:space="preserve">) that serves the built site from </w:t>
-      </w:r>
-      <w:r>
-        <w:rPr>
-          <w:rFonts w:ascii="Consolas" w:hAnsi="Consolas" w:cs="Consolas"/>
-          <w:color w:val="333333"/>
-          <w:sz w:val="19"/>
-          <w:szCs w:val="19"/>
-        </w:rPr>
-        <w:t xml:space="preserve">out/</w:t>
-      </w:r>
-      <w:r>
-        <w:rPr/>
-        <w:t xml:space="preserve"> and routes </w:t>
-      </w:r>
-      <w:r>
-        <w:rPr>
-          <w:rFonts w:ascii="Consolas" w:hAnsi="Consolas" w:cs="Consolas"/>
-          <w:color w:val="333333"/>
-          <w:sz w:val="19"/>
-          <w:szCs w:val="19"/>
-        </w:rPr>
-        <w:t xml:space="preserve">/api/redcap/session</w:t>
-      </w:r>
-      <w:r>
-        <w:rPr/>
-        <w:t xml:space="preserve">, </w:t>
-      </w:r>
-      <w:r>
-        <w:rPr>
-          <w:rFonts w:ascii="Consolas" w:hAnsi="Consolas" w:cs="Consolas"/>
-          <w:color w:val="333333"/>
-          <w:sz w:val="19"/>
-          <w:szCs w:val="19"/>
-        </w:rPr>
-        <w:t xml:space="preserve">/api/redcap/submit</w:t>
+        <w:t>3.3 Install on the server</w:t>
+      </w:r>
+    </w:p>
+    <w:p>
+      <w:pPr>
+        <w:pStyle w:val="ListParagraph"/>
+        <w:numPr>
+          <w:ilvl w:val="0"/>
+          <w:numId w:val="129"/>
+        </w:numPr>
+      </w:pPr>
+      <w:r>
+        <w:rPr/>
+        <w:t xml:space="preserve">Install Node.js 20 LTS and Git</w:t>
+      </w:r>
+    </w:p>
+    <w:p>
+      <w:pPr>
+        <w:pStyle w:val="ListParagraph"/>
+        <w:numPr>
+          <w:ilvl w:val="0"/>
+          <w:numId w:val="129"/>
+        </w:numPr>
+      </w:pPr>
+      <w:r>
+        <w:rPr/>
+        <w:t xml:space="preserve">Clone the lab's fork, for example into </w:t>
+      </w:r>
+      <w:r>
+        <w:rPr>
+          <w:rFonts w:ascii="Consolas" w:hAnsi="Consolas" w:cs="Consolas"/>
+          <w:color w:val="333333"/>
+          <w:sz w:val="19"/>
+          <w:szCs w:val="19"/>
+        </w:rPr>
+        <w:t xml:space="preserve">/opt/cts-survey</w:t>
+      </w:r>
+      <w:r>
+        <w:rPr/>
+        <w:t xml:space="preserve">, and check out the branch to deploy</w:t>
+      </w:r>
+    </w:p>
+    <w:p>
+      <w:pPr>
+        <w:pStyle w:val="ListParagraph"/>
+        <w:numPr>
+          <w:ilvl w:val="0"/>
+          <w:numId w:val="129"/>
+        </w:numPr>
+      </w:pPr>
+      <w:r>
+        <w:rPr/>
+        <w:t xml:space="preserve">Run </w:t>
+      </w:r>
+      <w:r>
+        <w:rPr>
+          <w:rFonts w:ascii="Consolas" w:hAnsi="Consolas" w:cs="Consolas"/>
+          <w:color w:val="333333"/>
+          <w:sz w:val="19"/>
+          <w:szCs w:val="19"/>
+        </w:rPr>
+        <w:t xml:space="preserve">npm ci</w:t>
       </w:r>
       <w:r>
         <w:rPr/>
@@ -1343,208 +1671,6 @@
           <w:sz w:val="19"/>
           <w:szCs w:val="19"/>
         </w:rPr>
-        <w:t xml:space="preserve">/api/redcap/provision</w:t>
-      </w:r>
-      <w:r>
-        <w:rPr/>
-        <w:t xml:space="preserve"> to the existing handlers, passing the environment variables as </w:t>
-      </w:r>
-      <w:r>
-        <w:rPr>
-          <w:rFonts w:ascii="Consolas" w:hAnsi="Consolas" w:cs="Consolas"/>
-          <w:color w:val="333333"/>
-          <w:sz w:val="19"/>
-          <w:szCs w:val="19"/>
-        </w:rPr>
-        <w:t xml:space="preserve">env</w:t>
-      </w:r>
-      <w:r>
-        <w:rPr/>
-        <w:t xml:space="preserve">. A framework that uses the same Request/Response style, such as Hono with its Node adapter, keeps this to a few lines</w:t>
-      </w:r>
-    </w:p>
-    <w:p>
-      <w:pPr>
-        <w:pStyle w:val="ListParagraph"/>
-        <w:numPr>
-          <w:ilvl w:val="0"/>
-          <w:numId w:val="123"/>
-        </w:numPr>
-      </w:pPr>
-      <w:r>
-        <w:rPr>
-          <w:b/>
-        </w:rPr>
-        <w:t xml:space="preserve">Security headers.</w:t>
-      </w:r>
-      <w:r>
-        <w:rPr/>
-        <w:t xml:space="preserve"> </w:t>
-      </w:r>
-      <w:r>
-        <w:rPr>
-          <w:rFonts w:ascii="Consolas" w:hAnsi="Consolas" w:cs="Consolas"/>
-          <w:color w:val="333333"/>
-          <w:sz w:val="19"/>
-          <w:szCs w:val="19"/>
-        </w:rPr>
-        <w:t xml:space="preserve">public/_headers</w:t>
-      </w:r>
-      <w:r>
-        <w:rPr/>
-        <w:t xml:space="preserve"> is a Cloudflare-specific file; set the same headers in the server or the reverse proxy</w:t>
-      </w:r>
-    </w:p>
-    <w:p>
-      <w:pPr>
-        <w:pStyle w:val="ListParagraph"/>
-        <w:numPr>
-          <w:ilvl w:val="0"/>
-          <w:numId w:val="123"/>
-        </w:numPr>
-      </w:pPr>
-      <w:r>
-        <w:rPr>
-          <w:b/>
-        </w:rPr>
-        <w:t xml:space="preserve">A start script</w:t>
-      </w:r>
-      <w:r>
-        <w:rPr/>
-        <w:t xml:space="preserve"> in </w:t>
-      </w:r>
-      <w:r>
-        <w:rPr>
-          <w:rFonts w:ascii="Consolas" w:hAnsi="Consolas" w:cs="Consolas"/>
-          <w:color w:val="333333"/>
-          <w:sz w:val="19"/>
-          <w:szCs w:val="19"/>
-        </w:rPr>
-        <w:t xml:space="preserve">package.json</w:t>
-      </w:r>
-      <w:r>
-        <w:rPr/>
-        <w:t xml:space="preserve"> (for example </w:t>
-      </w:r>
-      <w:r>
-        <w:rPr>
-          <w:rFonts w:ascii="Consolas" w:hAnsi="Consolas" w:cs="Consolas"/>
-          <w:color w:val="333333"/>
-          <w:sz w:val="19"/>
-          <w:szCs w:val="19"/>
-        </w:rPr>
-        <w:t xml:space="preserve">"start:server": "node server/index.mjs"</w:t>
-      </w:r>
-      <w:r>
-        <w:rPr/>
-        <w:t xml:space="preserve">)</w:t>
-      </w:r>
-    </w:p>
-    <w:p>
-      <w:pPr>
-        <w:pStyle w:val="ListParagraph"/>
-        <w:numPr>
-          <w:ilvl w:val="0"/>
-          <w:numId w:val="123"/>
-        </w:numPr>
-      </w:pPr>
-      <w:r>
-        <w:rPr/>
-        <w:t xml:space="preserve">Keep the site and the API on the same address, so the session cookie and the </w:t>
-      </w:r>
-      <w:r>
-        <w:rPr>
-          <w:rFonts w:ascii="Consolas" w:hAnsi="Consolas" w:cs="Consolas"/>
-          <w:color w:val="333333"/>
-          <w:sz w:val="19"/>
-          <w:szCs w:val="19"/>
-        </w:rPr>
-        <w:t xml:space="preserve">?k=</w:t>
-      </w:r>
-      <w:r>
-        <w:rPr/>
-        <w:t xml:space="preserve"> links work unchanged (Overview, Section 7.3)</w:t>
-      </w:r>
-    </w:p>
-    <w:p>
-      <w:pPr>
-        <w:pStyle w:val="Heading3"/>
-      </w:pPr>
-      <w:r>
-        <w:t>3.3 Install on the server</w:t>
-      </w:r>
-    </w:p>
-    <w:p>
-      <w:pPr>
-        <w:pStyle w:val="ListParagraph"/>
-        <w:numPr>
-          <w:ilvl w:val="0"/>
-          <w:numId w:val="125"/>
-        </w:numPr>
-      </w:pPr>
-      <w:r>
-        <w:rPr/>
-        <w:t xml:space="preserve">Install Node.js 20 LTS and Git</w:t>
-      </w:r>
-    </w:p>
-    <w:p>
-      <w:pPr>
-        <w:pStyle w:val="ListParagraph"/>
-        <w:numPr>
-          <w:ilvl w:val="0"/>
-          <w:numId w:val="125"/>
-        </w:numPr>
-      </w:pPr>
-      <w:r>
-        <w:rPr/>
-        <w:t xml:space="preserve">Clone the lab's fork, for example into </w:t>
-      </w:r>
-      <w:r>
-        <w:rPr>
-          <w:rFonts w:ascii="Consolas" w:hAnsi="Consolas" w:cs="Consolas"/>
-          <w:color w:val="333333"/>
-          <w:sz w:val="19"/>
-          <w:szCs w:val="19"/>
-        </w:rPr>
-        <w:t xml:space="preserve">/opt/cts-survey</w:t>
-      </w:r>
-      <w:r>
-        <w:rPr/>
-        <w:t xml:space="preserve">, and check out the branch to deploy</w:t>
-      </w:r>
-    </w:p>
-    <w:p>
-      <w:pPr>
-        <w:pStyle w:val="ListParagraph"/>
-        <w:numPr>
-          <w:ilvl w:val="0"/>
-          <w:numId w:val="125"/>
-        </w:numPr>
-      </w:pPr>
-      <w:r>
-        <w:rPr/>
-        <w:t xml:space="preserve">Run </w:t>
-      </w:r>
-      <w:r>
-        <w:rPr>
-          <w:rFonts w:ascii="Consolas" w:hAnsi="Consolas" w:cs="Consolas"/>
-          <w:color w:val="333333"/>
-          <w:sz w:val="19"/>
-          <w:szCs w:val="19"/>
-        </w:rPr>
-        <w:t xml:space="preserve">npm ci</w:t>
-      </w:r>
-      <w:r>
-        <w:rPr/>
-        <w:t xml:space="preserve"> and </w:t>
-      </w:r>
-      <w:r>
-        <w:rPr>
-          <w:rFonts w:ascii="Consolas" w:hAnsi="Consolas" w:cs="Consolas"/>
-          <w:color w:val="333333"/>
-          <w:sz w:val="19"/>
-          <w:szCs w:val="19"/>
-        </w:rPr>
         <w:t xml:space="preserve">npm run build</w:t>
       </w:r>
     </w:p>
@@ -1553,7 +1679,7 @@
         <w:pStyle w:val="ListParagraph"/>
         <w:numPr>
           <w:ilvl w:val="0"/>
-          <w:numId w:val="125"/>
+          <w:numId w:val="129"/>
         </w:numPr>
       </w:pPr>
       <w:r>
@@ -1592,7 +1718,7 @@
         <w:pStyle w:val="ListParagraph"/>
         <w:numPr>
           <w:ilvl w:val="0"/>
-          <w:numId w:val="125"/>
+          <w:numId w:val="129"/>
         </w:numPr>
       </w:pPr>
       <w:r>
@@ -1605,7 +1731,7 @@
         <w:pStyle w:val="ListParagraph"/>
         <w:numPr>
           <w:ilvl w:val="0"/>
-          <w:numId w:val="125"/>
+          <w:numId w:val="129"/>
         </w:numPr>
       </w:pPr>
       <w:r>
@@ -1755,7 +1881,7 @@
         <w:pStyle w:val="ListParagraph"/>
         <w:numPr>
           <w:ilvl w:val="0"/>
-          <w:numId w:val="126"/>
+          <w:numId w:val="130"/>
         </w:numPr>
       </w:pPr>
       <w:r>
@@ -1788,7 +1914,7 @@
         <w:pStyle w:val="ListParagraph"/>
         <w:numPr>
           <w:ilvl w:val="0"/>
-          <w:numId w:val="126"/>
+          <w:numId w:val="130"/>
         </w:numPr>
       </w:pPr>
       <w:r>
@@ -1801,7 +1927,7 @@
         <w:pStyle w:val="ListParagraph"/>
         <w:numPr>
           <w:ilvl w:val="0"/>
-          <w:numId w:val="126"/>
+          <w:numId w:val="130"/>
         </w:numPr>
       </w:pPr>
       <w:r>
@@ -1828,7 +1954,7 @@
         <w:pStyle w:val="ListParagraph"/>
         <w:numPr>
           <w:ilvl w:val="0"/>
-          <w:numId w:val="128"/>
+          <w:numId w:val="132"/>
         </w:numPr>
       </w:pPr>
       <w:r>
@@ -1882,7 +2008,7 @@
         <w:pStyle w:val="ListParagraph"/>
         <w:numPr>
           <w:ilvl w:val="0"/>
-          <w:numId w:val="128"/>
+          <w:numId w:val="132"/>
         </w:numPr>
       </w:pPr>
       <w:r>
@@ -2014,7 +2140,7 @@
         <w:pStyle w:val="ListParagraph"/>
         <w:numPr>
           <w:ilvl w:val="0"/>
-          <w:numId w:val="128"/>
+          <w:numId w:val="132"/>
         </w:numPr>
       </w:pPr>
       <w:r>
@@ -2033,7 +2159,7 @@
         <w:pStyle w:val="ListParagraph"/>
         <w:numPr>
           <w:ilvl w:val="0"/>
-          <w:numId w:val="128"/>
+          <w:numId w:val="132"/>
         </w:numPr>
       </w:pPr>
       <w:r>
@@ -2061,7 +2187,7 @@
         <w:pStyle w:val="ListParagraph"/>
         <w:numPr>
           <w:ilvl w:val="0"/>
-          <w:numId w:val="128"/>
+          <w:numId w:val="132"/>
         </w:numPr>
       </w:pPr>
       <w:r>
@@ -2089,7 +2215,7 @@
         <w:pStyle w:val="ListParagraph"/>
         <w:numPr>
           <w:ilvl w:val="0"/>
-          <w:numId w:val="128"/>
+          <w:numId w:val="132"/>
         </w:numPr>
       </w:pPr>
       <w:r>
@@ -2127,7 +2253,7 @@
         <w:pStyle w:val="ListParagraph"/>
         <w:numPr>
           <w:ilvl w:val="0"/>
-          <w:numId w:val="130"/>
+          <w:numId w:val="134"/>
         </w:numPr>
       </w:pPr>
       <w:r>
@@ -2149,7 +2275,7 @@
         <w:pStyle w:val="ListParagraph"/>
         <w:numPr>
           <w:ilvl w:val="0"/>
-          <w:numId w:val="130"/>
+          <w:numId w:val="134"/>
         </w:numPr>
       </w:pPr>
       <w:r>
@@ -2171,7 +2297,7 @@
         <w:pStyle w:val="ListParagraph"/>
         <w:numPr>
           <w:ilvl w:val="0"/>
-          <w:numId w:val="130"/>
+          <w:numId w:val="134"/>
         </w:numPr>
       </w:pPr>
       <w:r>
@@ -2193,7 +2319,7 @@
         <w:pStyle w:val="ListParagraph"/>
         <w:numPr>
           <w:ilvl w:val="0"/>
-          <w:numId w:val="130"/>
+          <w:numId w:val="134"/>
         </w:numPr>
       </w:pPr>
       <w:r>
@@ -2228,7 +2354,7 @@
         <w:pStyle w:val="ListParagraph"/>
         <w:numPr>
           <w:ilvl w:val="0"/>
-          <w:numId w:val="130"/>
+          <w:numId w:val="134"/>
         </w:numPr>
       </w:pPr>
       <w:r>
@@ -2250,7 +2376,7 @@
         <w:pStyle w:val="ListParagraph"/>
         <w:numPr>
           <w:ilvl w:val="0"/>
-          <w:numId w:val="130"/>
+          <w:numId w:val="134"/>
         </w:numPr>
       </w:pPr>
       <w:r>
@@ -2306,7 +2432,7 @@
         <w:pStyle w:val="ListParagraph"/>
         <w:numPr>
           <w:ilvl w:val="0"/>
-          <w:numId w:val="133"/>
+          <w:numId w:val="137"/>
         </w:numPr>
       </w:pPr>
       <w:r>
@@ -2332,7 +2458,7 @@
         <w:pStyle w:val="ListParagraph"/>
         <w:numPr>
           <w:ilvl w:val="0"/>
-          <w:numId w:val="133"/>
+          <w:numId w:val="137"/>
         </w:numPr>
       </w:pPr>
       <w:r>
@@ -2358,7 +2484,7 @@
         <w:pStyle w:val="ListParagraph"/>
         <w:numPr>
           <w:ilvl w:val="0"/>
-          <w:numId w:val="133"/>
+          <w:numId w:val="137"/>
         </w:numPr>
       </w:pPr>
       <w:r>
@@ -2371,7 +2497,7 @@
         <w:pStyle w:val="ListParagraph"/>
         <w:numPr>
           <w:ilvl w:val="0"/>
-          <w:numId w:val="133"/>
+          <w:numId w:val="137"/>
         </w:numPr>
       </w:pPr>
       <w:r>
@@ -2384,7 +2510,7 @@
         <w:pStyle w:val="ListParagraph"/>
         <w:numPr>
           <w:ilvl w:val="0"/>
-          <w:numId w:val="133"/>
+          <w:numId w:val="137"/>
         </w:numPr>
       </w:pPr>
       <w:r>
@@ -2405,7 +2531,7 @@
         <w:pStyle w:val="ListParagraph"/>
         <w:numPr>
           <w:ilvl w:val="0"/>
-          <w:numId w:val="134"/>
+          <w:numId w:val="138"/>
         </w:numPr>
       </w:pPr>
       <w:r>
@@ -2437,7 +2563,7 @@
         <w:pStyle w:val="ListParagraph"/>
         <w:numPr>
           <w:ilvl w:val="0"/>
-          <w:numId w:val="134"/>
+          <w:numId w:val="138"/>
         </w:numPr>
       </w:pPr>
       <w:r>
@@ -2469,7 +2595,7 @@
         <w:pStyle w:val="ListParagraph"/>
         <w:numPr>
           <w:ilvl w:val="0"/>
-          <w:numId w:val="134"/>
+          <w:numId w:val="138"/>
         </w:numPr>
       </w:pPr>
       <w:r>
@@ -2501,7 +2627,7 @@
         <w:pStyle w:val="ListParagraph"/>
         <w:numPr>
           <w:ilvl w:val="0"/>
-          <w:numId w:val="134"/>
+          <w:numId w:val="138"/>
         </w:numPr>
       </w:pPr>
       <w:r>
@@ -3536,6 +3662,30 @@
     </w:lvlOverride>
   </w:num>
   <w:num w:numId="135">
+    <w:abstractNumId w:val="901"/>
+    <w:lvlOverride w:ilvl="0">
+      <w:startOverride w:val="1"/>
+    </w:lvlOverride>
+  </w:num>
+  <w:num w:numId="136">
+    <w:abstractNumId w:val="900"/>
+    <w:lvlOverride w:ilvl="0">
+      <w:startOverride w:val="1"/>
+    </w:lvlOverride>
+  </w:num>
+  <w:num w:numId="137">
+    <w:abstractNumId w:val="901"/>
+    <w:lvlOverride w:ilvl="0">
+      <w:startOverride w:val="1"/>
+    </w:lvlOverride>
+  </w:num>
+  <w:num w:numId="138">
+    <w:abstractNumId w:val="900"/>
+    <w:lvlOverride w:ilvl="0">
+      <w:startOverride w:val="1"/>
+    </w:lvlOverride>
+  </w:num>
+  <w:num w:numId="139">
     <w:abstractNumId w:val="901"/>
     <w:lvlOverride w:ilvl="0">
       <w:startOverride w:val="1"/>

</xml_diff>

<commit_message>
Walkthrough: justify WTS server specs with measured memory use
Measured with the REDCap functions and built site in a Node.js test
server and a simulated REDCap: ~50 MB idle, 105 MB at 20 simultaneous
submissions, 226 MB at 300; npm ci peaks at 1.1 GB and the build at
0.7 GB, which is what sizes the RAM.

Co-Authored-By: Claude Opus 5.5 <noreply@anthropic.com>
Claude-Session: https://claude.ai/code/session_01WvzECS9tkcDkGpWoZeB54Z
</commit_message>
<xml_diff>
--- a/docs/CTS_GitHub_Server_Walkthrough.docx
+++ b/docs/CTS_GitHub_Server_Walkthrough.docx
@@ -1114,7 +1114,132 @@
     <w:p>
       <w:r>
         <w:rPr/>
-        <w:t xml:space="preserve">The specs are sized for the application, not for study data, which is stored in REDCap rather than on the server. The application needs about 1 GB of disk (code, dependencies and build); the rest of the 20 GB leaves room for the operating system, updates and logs. Storage costs $0.10 per GB, so the difference between 10 GB and 20 GB is about $1.</w:t>
+        <w:t xml:space="preserve">The specs are sized for the application, not for study data, which is stored in REDCap rather than on the server. Memory use was measured in October 2026 by running the REDCap functions and the built site in a Node.js test server with a simulated REDCap:</w:t>
+      </w:r>
+    </w:p>
+    <w:p>
+      <w:pPr>
+        <w:pStyle w:val="ListParagraph"/>
+        <w:numPr>
+          <w:ilvl w:val="0"/>
+          <w:numId w:val="122"/>
+        </w:numPr>
+      </w:pPr>
+      <w:r>
+        <w:rPr>
+          <w:b/>
+        </w:rPr>
+        <w:t xml:space="preserve">Running app:</w:t>
+      </w:r>
+      <w:r>
+        <w:rPr/>
+        <w:t xml:space="preserve"> about 50 MB idle, 105 MB with 20 participants submitting at the same moment, and 226 MB with 300 at the same moment (far beyond what the study will see)</w:t>
+      </w:r>
+    </w:p>
+    <w:p>
+      <w:pPr>
+        <w:pStyle w:val="ListParagraph"/>
+        <w:numPr>
+          <w:ilvl w:val="0"/>
+          <w:numId w:val="122"/>
+        </w:numPr>
+      </w:pPr>
+      <w:r>
+        <w:rPr>
+          <w:b/>
+        </w:rPr>
+        <w:t xml:space="preserve">Updating the app (Section 3.4):</w:t>
+      </w:r>
+      <w:r>
+        <w:rPr/>
+        <w:t xml:space="preserve"> installing dependencies (</w:t>
+      </w:r>
+      <w:r>
+        <w:rPr>
+          <w:rFonts w:ascii="Consolas" w:hAnsi="Consolas" w:cs="Consolas"/>
+          <w:color w:val="333333"/>
+          <w:sz w:val="19"/>
+          <w:szCs w:val="19"/>
+        </w:rPr>
+        <w:t xml:space="preserve">npm ci</w:t>
+      </w:r>
+      <w:r>
+        <w:rPr/>
+        <w:t xml:space="preserve">) peaked at 1.1 GB and building (</w:t>
+      </w:r>
+      <w:r>
+        <w:rPr>
+          <w:rFonts w:ascii="Consolas" w:hAnsi="Consolas" w:cs="Consolas"/>
+          <w:color w:val="333333"/>
+          <w:sz w:val="19"/>
+          <w:szCs w:val="19"/>
+        </w:rPr>
+        <w:t xml:space="preserve">npm run build</w:t>
+      </w:r>
+      <w:r>
+        <w:rPr/>
+        <w:t xml:space="preserve">) at 0.7 GB, while the running app keeps serving participants</w:t>
+      </w:r>
+    </w:p>
+    <w:p>
+      <w:pPr>
+        <w:pStyle w:val="ListParagraph"/>
+        <w:numPr>
+          <w:ilvl w:val="0"/>
+          <w:numId w:val="122"/>
+        </w:numPr>
+      </w:pPr>
+      <w:r>
+        <w:rPr>
+          <w:b/>
+        </w:rPr>
+        <w:t xml:space="preserve">Disk:</w:t>
+      </w:r>
+      <w:r>
+        <w:rPr/>
+        <w:t xml:space="preserve"> about 1 GB for the code, dependencies and build</w:t>
+      </w:r>
+    </w:p>
+    <w:p>
+      <w:r>
+        <w:rPr>
+          <w:b/>
+        </w:rPr>
+        <w:t xml:space="preserve">4 GB RAM</w:t>
+      </w:r>
+      <w:r>
+        <w:rPr/>
+        <w:t xml:space="preserve"> leaves room for the operating system and web server alongside an update, which is the largest load the server sees. </w:t>
+      </w:r>
+      <w:r>
+        <w:rPr>
+          <w:b/>
+        </w:rPr>
+        <w:t xml:space="preserve">2 GB</w:t>
+      </w:r>
+      <w:r>
+        <w:rPr/>
+        <w:t xml:space="preserve"> would be enough if updates are built elsewhere (for example on the maintainer's computer) and only the built site and server code are copied to the server; that saves $8 (2 GB × $4). </w:t>
+      </w:r>
+      <w:r>
+        <w:rPr>
+          <w:b/>
+        </w:rPr>
+        <w:t xml:space="preserve">2 shared cores</w:t>
+      </w:r>
+      <w:r>
+        <w:rPr/>
+        <w:t xml:space="preserve"> are plenty for the running app; updates just take a little longer. </w:t>
+      </w:r>
+      <w:r>
+        <w:rPr>
+          <w:b/>
+        </w:rPr>
+        <w:t xml:space="preserve">20 GB</w:t>
+      </w:r>
+      <w:r>
+        <w:rPr/>
+        <w:t xml:space="preserve"> of storage leaves room for the operating system, updates and logs; at $0.10 per GB, 10 GB versus 20 GB differs by about $1.</w:t>
       </w:r>
     </w:p>
     <w:p>
@@ -1128,7 +1253,7 @@
         <w:pStyle w:val="ListParagraph"/>
         <w:numPr>
           <w:ilvl w:val="0"/>
-          <w:numId w:val="122"/>
+          <w:numId w:val="124"/>
         </w:numPr>
       </w:pPr>
       <w:r>
@@ -1147,7 +1272,7 @@
         <w:pStyle w:val="ListParagraph"/>
         <w:numPr>
           <w:ilvl w:val="0"/>
-          <w:numId w:val="122"/>
+          <w:numId w:val="124"/>
         </w:numPr>
       </w:pPr>
       <w:r>
@@ -1166,7 +1291,7 @@
         <w:pStyle w:val="ListParagraph"/>
         <w:numPr>
           <w:ilvl w:val="0"/>
-          <w:numId w:val="122"/>
+          <w:numId w:val="124"/>
         </w:numPr>
       </w:pPr>
       <w:r>
@@ -1201,7 +1326,7 @@
         <w:pStyle w:val="ListParagraph"/>
         <w:numPr>
           <w:ilvl w:val="0"/>
-          <w:numId w:val="124"/>
+          <w:numId w:val="126"/>
         </w:numPr>
       </w:pPr>
       <w:r>
@@ -1220,7 +1345,7 @@
         <w:pStyle w:val="ListParagraph"/>
         <w:numPr>
           <w:ilvl w:val="0"/>
-          <w:numId w:val="124"/>
+          <w:numId w:val="126"/>
         </w:numPr>
       </w:pPr>
       <w:r>
@@ -1262,7 +1387,7 @@
         <w:pStyle w:val="ListParagraph"/>
         <w:numPr>
           <w:ilvl w:val="0"/>
-          <w:numId w:val="124"/>
+          <w:numId w:val="126"/>
         </w:numPr>
       </w:pPr>
       <w:r>
@@ -1281,7 +1406,7 @@
         <w:pStyle w:val="ListParagraph"/>
         <w:numPr>
           <w:ilvl w:val="0"/>
-          <w:numId w:val="124"/>
+          <w:numId w:val="126"/>
         </w:numPr>
       </w:pPr>
       <w:r>
@@ -1300,7 +1425,7 @@
         <w:pStyle w:val="ListParagraph"/>
         <w:numPr>
           <w:ilvl w:val="0"/>
-          <w:numId w:val="124"/>
+          <w:numId w:val="126"/>
         </w:numPr>
       </w:pPr>
       <w:r>
@@ -1319,7 +1444,7 @@
         <w:pStyle w:val="ListParagraph"/>
         <w:numPr>
           <w:ilvl w:val="0"/>
-          <w:numId w:val="124"/>
+          <w:numId w:val="126"/>
         </w:numPr>
       </w:pPr>
       <w:r>
@@ -1351,7 +1476,7 @@
         <w:pStyle w:val="ListParagraph"/>
         <w:numPr>
           <w:ilvl w:val="0"/>
-          <w:numId w:val="124"/>
+          <w:numId w:val="126"/>
         </w:numPr>
       </w:pPr>
       <w:r>
@@ -1397,7 +1522,7 @@
         <w:pStyle w:val="ListParagraph"/>
         <w:numPr>
           <w:ilvl w:val="0"/>
-          <w:numId w:val="127"/>
+          <w:numId w:val="129"/>
         </w:numPr>
       </w:pPr>
       <w:r>
@@ -1494,7 +1619,7 @@
         <w:pStyle w:val="ListParagraph"/>
         <w:numPr>
           <w:ilvl w:val="0"/>
-          <w:numId w:val="127"/>
+          <w:numId w:val="129"/>
         </w:numPr>
       </w:pPr>
       <w:r>
@@ -1526,7 +1651,7 @@
         <w:pStyle w:val="ListParagraph"/>
         <w:numPr>
           <w:ilvl w:val="0"/>
-          <w:numId w:val="127"/>
+          <w:numId w:val="129"/>
         </w:numPr>
       </w:pPr>
       <w:r>
@@ -1571,7 +1696,7 @@
         <w:pStyle w:val="ListParagraph"/>
         <w:numPr>
           <w:ilvl w:val="0"/>
-          <w:numId w:val="127"/>
+          <w:numId w:val="129"/>
         </w:numPr>
       </w:pPr>
       <w:r>
@@ -1605,7 +1730,7 @@
         <w:pStyle w:val="ListParagraph"/>
         <w:numPr>
           <w:ilvl w:val="0"/>
-          <w:numId w:val="129"/>
+          <w:numId w:val="131"/>
         </w:numPr>
       </w:pPr>
       <w:r>
@@ -1618,7 +1743,7 @@
         <w:pStyle w:val="ListParagraph"/>
         <w:numPr>
           <w:ilvl w:val="0"/>
-          <w:numId w:val="129"/>
+          <w:numId w:val="131"/>
         </w:numPr>
       </w:pPr>
       <w:r>
@@ -1644,7 +1769,7 @@
         <w:pStyle w:val="ListParagraph"/>
         <w:numPr>
           <w:ilvl w:val="0"/>
-          <w:numId w:val="129"/>
+          <w:numId w:val="131"/>
         </w:numPr>
       </w:pPr>
       <w:r>
@@ -1679,7 +1804,7 @@
         <w:pStyle w:val="ListParagraph"/>
         <w:numPr>
           <w:ilvl w:val="0"/>
-          <w:numId w:val="129"/>
+          <w:numId w:val="131"/>
         </w:numPr>
       </w:pPr>
       <w:r>
@@ -1718,7 +1843,7 @@
         <w:pStyle w:val="ListParagraph"/>
         <w:numPr>
           <w:ilvl w:val="0"/>
-          <w:numId w:val="129"/>
+          <w:numId w:val="131"/>
         </w:numPr>
       </w:pPr>
       <w:r>
@@ -1731,7 +1856,7 @@
         <w:pStyle w:val="ListParagraph"/>
         <w:numPr>
           <w:ilvl w:val="0"/>
-          <w:numId w:val="129"/>
+          <w:numId w:val="131"/>
         </w:numPr>
       </w:pPr>
       <w:r>
@@ -1881,7 +2006,7 @@
         <w:pStyle w:val="ListParagraph"/>
         <w:numPr>
           <w:ilvl w:val="0"/>
-          <w:numId w:val="130"/>
+          <w:numId w:val="132"/>
         </w:numPr>
       </w:pPr>
       <w:r>
@@ -1914,7 +2039,7 @@
         <w:pStyle w:val="ListParagraph"/>
         <w:numPr>
           <w:ilvl w:val="0"/>
-          <w:numId w:val="130"/>
+          <w:numId w:val="132"/>
         </w:numPr>
       </w:pPr>
       <w:r>
@@ -1927,7 +2052,7 @@
         <w:pStyle w:val="ListParagraph"/>
         <w:numPr>
           <w:ilvl w:val="0"/>
-          <w:numId w:val="130"/>
+          <w:numId w:val="132"/>
         </w:numPr>
       </w:pPr>
       <w:r>
@@ -1954,7 +2079,7 @@
         <w:pStyle w:val="ListParagraph"/>
         <w:numPr>
           <w:ilvl w:val="0"/>
-          <w:numId w:val="132"/>
+          <w:numId w:val="134"/>
         </w:numPr>
       </w:pPr>
       <w:r>
@@ -2008,7 +2133,7 @@
         <w:pStyle w:val="ListParagraph"/>
         <w:numPr>
           <w:ilvl w:val="0"/>
-          <w:numId w:val="132"/>
+          <w:numId w:val="134"/>
         </w:numPr>
       </w:pPr>
       <w:r>
@@ -2140,7 +2265,7 @@
         <w:pStyle w:val="ListParagraph"/>
         <w:numPr>
           <w:ilvl w:val="0"/>
-          <w:numId w:val="132"/>
+          <w:numId w:val="134"/>
         </w:numPr>
       </w:pPr>
       <w:r>
@@ -2159,7 +2284,7 @@
         <w:pStyle w:val="ListParagraph"/>
         <w:numPr>
           <w:ilvl w:val="0"/>
-          <w:numId w:val="132"/>
+          <w:numId w:val="134"/>
         </w:numPr>
       </w:pPr>
       <w:r>
@@ -2187,7 +2312,7 @@
         <w:pStyle w:val="ListParagraph"/>
         <w:numPr>
           <w:ilvl w:val="0"/>
-          <w:numId w:val="132"/>
+          <w:numId w:val="134"/>
         </w:numPr>
       </w:pPr>
       <w:r>
@@ -2215,7 +2340,7 @@
         <w:pStyle w:val="ListParagraph"/>
         <w:numPr>
           <w:ilvl w:val="0"/>
-          <w:numId w:val="132"/>
+          <w:numId w:val="134"/>
         </w:numPr>
       </w:pPr>
       <w:r>
@@ -2253,7 +2378,7 @@
         <w:pStyle w:val="ListParagraph"/>
         <w:numPr>
           <w:ilvl w:val="0"/>
-          <w:numId w:val="134"/>
+          <w:numId w:val="136"/>
         </w:numPr>
       </w:pPr>
       <w:r>
@@ -2275,7 +2400,7 @@
         <w:pStyle w:val="ListParagraph"/>
         <w:numPr>
           <w:ilvl w:val="0"/>
-          <w:numId w:val="134"/>
+          <w:numId w:val="136"/>
         </w:numPr>
       </w:pPr>
       <w:r>
@@ -2297,7 +2422,7 @@
         <w:pStyle w:val="ListParagraph"/>
         <w:numPr>
           <w:ilvl w:val="0"/>
-          <w:numId w:val="134"/>
+          <w:numId w:val="136"/>
         </w:numPr>
       </w:pPr>
       <w:r>
@@ -2319,7 +2444,7 @@
         <w:pStyle w:val="ListParagraph"/>
         <w:numPr>
           <w:ilvl w:val="0"/>
-          <w:numId w:val="134"/>
+          <w:numId w:val="136"/>
         </w:numPr>
       </w:pPr>
       <w:r>
@@ -2354,7 +2479,7 @@
         <w:pStyle w:val="ListParagraph"/>
         <w:numPr>
           <w:ilvl w:val="0"/>
-          <w:numId w:val="134"/>
+          <w:numId w:val="136"/>
         </w:numPr>
       </w:pPr>
       <w:r>
@@ -2376,7 +2501,7 @@
         <w:pStyle w:val="ListParagraph"/>
         <w:numPr>
           <w:ilvl w:val="0"/>
-          <w:numId w:val="134"/>
+          <w:numId w:val="136"/>
         </w:numPr>
       </w:pPr>
       <w:r>
@@ -2432,7 +2557,7 @@
         <w:pStyle w:val="ListParagraph"/>
         <w:numPr>
           <w:ilvl w:val="0"/>
-          <w:numId w:val="137"/>
+          <w:numId w:val="139"/>
         </w:numPr>
       </w:pPr>
       <w:r>
@@ -2458,7 +2583,7 @@
         <w:pStyle w:val="ListParagraph"/>
         <w:numPr>
           <w:ilvl w:val="0"/>
-          <w:numId w:val="137"/>
+          <w:numId w:val="139"/>
         </w:numPr>
       </w:pPr>
       <w:r>
@@ -2484,7 +2609,7 @@
         <w:pStyle w:val="ListParagraph"/>
         <w:numPr>
           <w:ilvl w:val="0"/>
-          <w:numId w:val="137"/>
+          <w:numId w:val="139"/>
         </w:numPr>
       </w:pPr>
       <w:r>
@@ -2497,7 +2622,7 @@
         <w:pStyle w:val="ListParagraph"/>
         <w:numPr>
           <w:ilvl w:val="0"/>
-          <w:numId w:val="137"/>
+          <w:numId w:val="139"/>
         </w:numPr>
       </w:pPr>
       <w:r>
@@ -2510,7 +2635,7 @@
         <w:pStyle w:val="ListParagraph"/>
         <w:numPr>
           <w:ilvl w:val="0"/>
-          <w:numId w:val="137"/>
+          <w:numId w:val="139"/>
         </w:numPr>
       </w:pPr>
       <w:r>
@@ -2531,7 +2656,7 @@
         <w:pStyle w:val="ListParagraph"/>
         <w:numPr>
           <w:ilvl w:val="0"/>
-          <w:numId w:val="138"/>
+          <w:numId w:val="140"/>
         </w:numPr>
       </w:pPr>
       <w:r>
@@ -2563,7 +2688,7 @@
         <w:pStyle w:val="ListParagraph"/>
         <w:numPr>
           <w:ilvl w:val="0"/>
-          <w:numId w:val="138"/>
+          <w:numId w:val="140"/>
         </w:numPr>
       </w:pPr>
       <w:r>
@@ -2595,7 +2720,7 @@
         <w:pStyle w:val="ListParagraph"/>
         <w:numPr>
           <w:ilvl w:val="0"/>
-          <w:numId w:val="138"/>
+          <w:numId w:val="140"/>
         </w:numPr>
       </w:pPr>
       <w:r>
@@ -2627,7 +2752,7 @@
         <w:pStyle w:val="ListParagraph"/>
         <w:numPr>
           <w:ilvl w:val="0"/>
-          <w:numId w:val="138"/>
+          <w:numId w:val="140"/>
         </w:numPr>
       </w:pPr>
       <w:r>
@@ -3686,6 +3811,18 @@
     </w:lvlOverride>
   </w:num>
   <w:num w:numId="139">
+    <w:abstractNumId w:val="901"/>
+    <w:lvlOverride w:ilvl="0">
+      <w:startOverride w:val="1"/>
+    </w:lvlOverride>
+  </w:num>
+  <w:num w:numId="140">
+    <w:abstractNumId w:val="900"/>
+    <w:lvlOverride w:ilvl="0">
+      <w:startOverride w:val="1"/>
+    </w:lvlOverride>
+  </w:num>
+  <w:num w:numId="141">
     <w:abstractNumId w:val="901"/>
     <w:lvlOverride w:ilvl="0">
       <w:startOverride w:val="1"/>

</xml_diff>

<commit_message>
Walkthrough: break down the proposed $64 server cost
Keep the 2-core / 4 GB / 20 GB proposal and show what each part of the
cost covers, based on the measured memory use.

Co-Authored-By: Claude Opus 5.5 <noreply@anthropic.com>
Claude-Session: https://claude.ai/code/session_01WvzECS9tkcDkGpWoZeB54Z
</commit_message>
<xml_diff>
--- a/docs/CTS_GitHub_Server_Walkthrough.docx
+++ b/docs/CTS_GitHub_Server_Walkthrough.docx
@@ -1202,44 +1202,84 @@
     </w:p>
     <w:p>
       <w:r>
+        <w:rPr/>
+        <w:t xml:space="preserve">This is what the proposed $64 covers:</w:t>
+      </w:r>
+    </w:p>
+    <w:p>
+      <w:pPr>
+        <w:pStyle w:val="ListParagraph"/>
+        <w:numPr>
+          <w:ilvl w:val="0"/>
+          <w:numId w:val="124"/>
+        </w:numPr>
+      </w:pPr>
+      <w:r>
         <w:rPr>
           <w:b/>
         </w:rPr>
-        <w:t xml:space="preserve">4 GB RAM</w:t>
-      </w:r>
-      <w:r>
-        <w:rPr/>
-        <w:t xml:space="preserve"> leaves room for the operating system and web server alongside an update, which is the largest load the server sees. </w:t>
-      </w:r>
+        <w:t xml:space="preserve">4 GB RAM ($16):</w:t>
+      </w:r>
+      <w:r>
+        <w:rPr/>
+        <w:t xml:space="preserve"> room for the operating system and web server alongside an update, which is the largest load the server sees</w:t>
+      </w:r>
+    </w:p>
+    <w:p>
+      <w:pPr>
+        <w:pStyle w:val="ListParagraph"/>
+        <w:numPr>
+          <w:ilvl w:val="0"/>
+          <w:numId w:val="124"/>
+        </w:numPr>
+      </w:pPr>
       <w:r>
         <w:rPr>
           <w:b/>
         </w:rPr>
-        <w:t xml:space="preserve">2 GB</w:t>
-      </w:r>
-      <w:r>
-        <w:rPr/>
-        <w:t xml:space="preserve"> would be enough if updates are built elsewhere (for example on the maintainer's computer) and only the built site and server code are copied to the server; that saves $8 (2 GB × $4). </w:t>
-      </w:r>
+        <w:t xml:space="preserve">2 shared cores ($6):</w:t>
+      </w:r>
+      <w:r>
+        <w:rPr/>
+        <w:t xml:space="preserve"> plenty for the running app; updates just take a little longer</w:t>
+      </w:r>
+    </w:p>
+    <w:p>
+      <w:pPr>
+        <w:pStyle w:val="ListParagraph"/>
+        <w:numPr>
+          <w:ilvl w:val="0"/>
+          <w:numId w:val="124"/>
+        </w:numPr>
+      </w:pPr>
       <w:r>
         <w:rPr>
           <w:b/>
         </w:rPr>
-        <w:t xml:space="preserve">2 shared cores</w:t>
-      </w:r>
-      <w:r>
-        <w:rPr/>
-        <w:t xml:space="preserve"> are plenty for the running app; updates just take a little longer. </w:t>
-      </w:r>
+        <w:t xml:space="preserve">20 GB storage ($2):</w:t>
+      </w:r>
+      <w:r>
+        <w:rPr/>
+        <w:t xml:space="preserve"> room for the operating system, updates and logs on top of the application's 1 GB</w:t>
+      </w:r>
+    </w:p>
+    <w:p>
+      <w:pPr>
+        <w:pStyle w:val="ListParagraph"/>
+        <w:numPr>
+          <w:ilvl w:val="0"/>
+          <w:numId w:val="124"/>
+        </w:numPr>
+      </w:pPr>
       <w:r>
         <w:rPr>
           <w:b/>
         </w:rPr>
-        <w:t xml:space="preserve">20 GB</w:t>
-      </w:r>
-      <w:r>
-        <w:rPr/>
-        <w:t xml:space="preserve"> of storage leaves room for the operating system, updates and logs; at $0.10 per GB, 10 GB versus 20 GB differs by about $1.</w:t>
+        <w:t xml:space="preserve">Base VM ($40):</w:t>
+      </w:r>
+      <w:r>
+        <w:rPr/>
+        <w:t xml:space="preserve"> the fixed charge per server; what it includes is listed below</w:t>
       </w:r>
     </w:p>
     <w:p>
@@ -1253,7 +1293,7 @@
         <w:pStyle w:val="ListParagraph"/>
         <w:numPr>
           <w:ilvl w:val="0"/>
-          <w:numId w:val="124"/>
+          <w:numId w:val="126"/>
         </w:numPr>
       </w:pPr>
       <w:r>
@@ -1272,7 +1312,7 @@
         <w:pStyle w:val="ListParagraph"/>
         <w:numPr>
           <w:ilvl w:val="0"/>
-          <w:numId w:val="124"/>
+          <w:numId w:val="126"/>
         </w:numPr>
       </w:pPr>
       <w:r>
@@ -1291,7 +1331,7 @@
         <w:pStyle w:val="ListParagraph"/>
         <w:numPr>
           <w:ilvl w:val="0"/>
-          <w:numId w:val="124"/>
+          <w:numId w:val="126"/>
         </w:numPr>
       </w:pPr>
       <w:r>
@@ -1326,7 +1366,7 @@
         <w:pStyle w:val="ListParagraph"/>
         <w:numPr>
           <w:ilvl w:val="0"/>
-          <w:numId w:val="126"/>
+          <w:numId w:val="128"/>
         </w:numPr>
       </w:pPr>
       <w:r>
@@ -1345,7 +1385,7 @@
         <w:pStyle w:val="ListParagraph"/>
         <w:numPr>
           <w:ilvl w:val="0"/>
-          <w:numId w:val="126"/>
+          <w:numId w:val="128"/>
         </w:numPr>
       </w:pPr>
       <w:r>
@@ -1387,7 +1427,7 @@
         <w:pStyle w:val="ListParagraph"/>
         <w:numPr>
           <w:ilvl w:val="0"/>
-          <w:numId w:val="126"/>
+          <w:numId w:val="128"/>
         </w:numPr>
       </w:pPr>
       <w:r>
@@ -1406,7 +1446,7 @@
         <w:pStyle w:val="ListParagraph"/>
         <w:numPr>
           <w:ilvl w:val="0"/>
-          <w:numId w:val="126"/>
+          <w:numId w:val="128"/>
         </w:numPr>
       </w:pPr>
       <w:r>
@@ -1425,7 +1465,7 @@
         <w:pStyle w:val="ListParagraph"/>
         <w:numPr>
           <w:ilvl w:val="0"/>
-          <w:numId w:val="126"/>
+          <w:numId w:val="128"/>
         </w:numPr>
       </w:pPr>
       <w:r>
@@ -1444,7 +1484,7 @@
         <w:pStyle w:val="ListParagraph"/>
         <w:numPr>
           <w:ilvl w:val="0"/>
-          <w:numId w:val="126"/>
+          <w:numId w:val="128"/>
         </w:numPr>
       </w:pPr>
       <w:r>
@@ -1476,7 +1516,7 @@
         <w:pStyle w:val="ListParagraph"/>
         <w:numPr>
           <w:ilvl w:val="0"/>
-          <w:numId w:val="126"/>
+          <w:numId w:val="128"/>
         </w:numPr>
       </w:pPr>
       <w:r>
@@ -1522,7 +1562,7 @@
         <w:pStyle w:val="ListParagraph"/>
         <w:numPr>
           <w:ilvl w:val="0"/>
-          <w:numId w:val="129"/>
+          <w:numId w:val="131"/>
         </w:numPr>
       </w:pPr>
       <w:r>
@@ -1619,7 +1659,7 @@
         <w:pStyle w:val="ListParagraph"/>
         <w:numPr>
           <w:ilvl w:val="0"/>
-          <w:numId w:val="129"/>
+          <w:numId w:val="131"/>
         </w:numPr>
       </w:pPr>
       <w:r>
@@ -1651,7 +1691,7 @@
         <w:pStyle w:val="ListParagraph"/>
         <w:numPr>
           <w:ilvl w:val="0"/>
-          <w:numId w:val="129"/>
+          <w:numId w:val="131"/>
         </w:numPr>
       </w:pPr>
       <w:r>
@@ -1696,7 +1736,7 @@
         <w:pStyle w:val="ListParagraph"/>
         <w:numPr>
           <w:ilvl w:val="0"/>
-          <w:numId w:val="129"/>
+          <w:numId w:val="131"/>
         </w:numPr>
       </w:pPr>
       <w:r>
@@ -1730,7 +1770,7 @@
         <w:pStyle w:val="ListParagraph"/>
         <w:numPr>
           <w:ilvl w:val="0"/>
-          <w:numId w:val="131"/>
+          <w:numId w:val="133"/>
         </w:numPr>
       </w:pPr>
       <w:r>
@@ -1743,7 +1783,7 @@
         <w:pStyle w:val="ListParagraph"/>
         <w:numPr>
           <w:ilvl w:val="0"/>
-          <w:numId w:val="131"/>
+          <w:numId w:val="133"/>
         </w:numPr>
       </w:pPr>
       <w:r>
@@ -1769,7 +1809,7 @@
         <w:pStyle w:val="ListParagraph"/>
         <w:numPr>
           <w:ilvl w:val="0"/>
-          <w:numId w:val="131"/>
+          <w:numId w:val="133"/>
         </w:numPr>
       </w:pPr>
       <w:r>
@@ -1804,7 +1844,7 @@
         <w:pStyle w:val="ListParagraph"/>
         <w:numPr>
           <w:ilvl w:val="0"/>
-          <w:numId w:val="131"/>
+          <w:numId w:val="133"/>
         </w:numPr>
       </w:pPr>
       <w:r>
@@ -1843,7 +1883,7 @@
         <w:pStyle w:val="ListParagraph"/>
         <w:numPr>
           <w:ilvl w:val="0"/>
-          <w:numId w:val="131"/>
+          <w:numId w:val="133"/>
         </w:numPr>
       </w:pPr>
       <w:r>
@@ -1856,7 +1896,7 @@
         <w:pStyle w:val="ListParagraph"/>
         <w:numPr>
           <w:ilvl w:val="0"/>
-          <w:numId w:val="131"/>
+          <w:numId w:val="133"/>
         </w:numPr>
       </w:pPr>
       <w:r>
@@ -2006,7 +2046,7 @@
         <w:pStyle w:val="ListParagraph"/>
         <w:numPr>
           <w:ilvl w:val="0"/>
-          <w:numId w:val="132"/>
+          <w:numId w:val="134"/>
         </w:numPr>
       </w:pPr>
       <w:r>
@@ -2039,7 +2079,7 @@
         <w:pStyle w:val="ListParagraph"/>
         <w:numPr>
           <w:ilvl w:val="0"/>
-          <w:numId w:val="132"/>
+          <w:numId w:val="134"/>
         </w:numPr>
       </w:pPr>
       <w:r>
@@ -2052,7 +2092,7 @@
         <w:pStyle w:val="ListParagraph"/>
         <w:numPr>
           <w:ilvl w:val="0"/>
-          <w:numId w:val="132"/>
+          <w:numId w:val="134"/>
         </w:numPr>
       </w:pPr>
       <w:r>
@@ -2079,7 +2119,7 @@
         <w:pStyle w:val="ListParagraph"/>
         <w:numPr>
           <w:ilvl w:val="0"/>
-          <w:numId w:val="134"/>
+          <w:numId w:val="136"/>
         </w:numPr>
       </w:pPr>
       <w:r>
@@ -2133,7 +2173,7 @@
         <w:pStyle w:val="ListParagraph"/>
         <w:numPr>
           <w:ilvl w:val="0"/>
-          <w:numId w:val="134"/>
+          <w:numId w:val="136"/>
         </w:numPr>
       </w:pPr>
       <w:r>
@@ -2265,7 +2305,7 @@
         <w:pStyle w:val="ListParagraph"/>
         <w:numPr>
           <w:ilvl w:val="0"/>
-          <w:numId w:val="134"/>
+          <w:numId w:val="136"/>
         </w:numPr>
       </w:pPr>
       <w:r>
@@ -2284,7 +2324,7 @@
         <w:pStyle w:val="ListParagraph"/>
         <w:numPr>
           <w:ilvl w:val="0"/>
-          <w:numId w:val="134"/>
+          <w:numId w:val="136"/>
         </w:numPr>
       </w:pPr>
       <w:r>
@@ -2312,7 +2352,7 @@
         <w:pStyle w:val="ListParagraph"/>
         <w:numPr>
           <w:ilvl w:val="0"/>
-          <w:numId w:val="134"/>
+          <w:numId w:val="136"/>
         </w:numPr>
       </w:pPr>
       <w:r>
@@ -2340,7 +2380,7 @@
         <w:pStyle w:val="ListParagraph"/>
         <w:numPr>
           <w:ilvl w:val="0"/>
-          <w:numId w:val="134"/>
+          <w:numId w:val="136"/>
         </w:numPr>
       </w:pPr>
       <w:r>
@@ -2378,7 +2418,7 @@
         <w:pStyle w:val="ListParagraph"/>
         <w:numPr>
           <w:ilvl w:val="0"/>
-          <w:numId w:val="136"/>
+          <w:numId w:val="138"/>
         </w:numPr>
       </w:pPr>
       <w:r>
@@ -2400,7 +2440,7 @@
         <w:pStyle w:val="ListParagraph"/>
         <w:numPr>
           <w:ilvl w:val="0"/>
-          <w:numId w:val="136"/>
+          <w:numId w:val="138"/>
         </w:numPr>
       </w:pPr>
       <w:r>
@@ -2422,7 +2462,7 @@
         <w:pStyle w:val="ListParagraph"/>
         <w:numPr>
           <w:ilvl w:val="0"/>
-          <w:numId w:val="136"/>
+          <w:numId w:val="138"/>
         </w:numPr>
       </w:pPr>
       <w:r>
@@ -2444,7 +2484,7 @@
         <w:pStyle w:val="ListParagraph"/>
         <w:numPr>
           <w:ilvl w:val="0"/>
-          <w:numId w:val="136"/>
+          <w:numId w:val="138"/>
         </w:numPr>
       </w:pPr>
       <w:r>
@@ -2479,7 +2519,7 @@
         <w:pStyle w:val="ListParagraph"/>
         <w:numPr>
           <w:ilvl w:val="0"/>
-          <w:numId w:val="136"/>
+          <w:numId w:val="138"/>
         </w:numPr>
       </w:pPr>
       <w:r>
@@ -2501,7 +2541,7 @@
         <w:pStyle w:val="ListParagraph"/>
         <w:numPr>
           <w:ilvl w:val="0"/>
-          <w:numId w:val="136"/>
+          <w:numId w:val="138"/>
         </w:numPr>
       </w:pPr>
       <w:r>
@@ -2557,7 +2597,7 @@
         <w:pStyle w:val="ListParagraph"/>
         <w:numPr>
           <w:ilvl w:val="0"/>
-          <w:numId w:val="139"/>
+          <w:numId w:val="141"/>
         </w:numPr>
       </w:pPr>
       <w:r>
@@ -2583,7 +2623,7 @@
         <w:pStyle w:val="ListParagraph"/>
         <w:numPr>
           <w:ilvl w:val="0"/>
-          <w:numId w:val="139"/>
+          <w:numId w:val="141"/>
         </w:numPr>
       </w:pPr>
       <w:r>
@@ -2609,7 +2649,7 @@
         <w:pStyle w:val="ListParagraph"/>
         <w:numPr>
           <w:ilvl w:val="0"/>
-          <w:numId w:val="139"/>
+          <w:numId w:val="141"/>
         </w:numPr>
       </w:pPr>
       <w:r>
@@ -2622,7 +2662,7 @@
         <w:pStyle w:val="ListParagraph"/>
         <w:numPr>
           <w:ilvl w:val="0"/>
-          <w:numId w:val="139"/>
+          <w:numId w:val="141"/>
         </w:numPr>
       </w:pPr>
       <w:r>
@@ -2635,7 +2675,7 @@
         <w:pStyle w:val="ListParagraph"/>
         <w:numPr>
           <w:ilvl w:val="0"/>
-          <w:numId w:val="139"/>
+          <w:numId w:val="141"/>
         </w:numPr>
       </w:pPr>
       <w:r>
@@ -2656,7 +2696,7 @@
         <w:pStyle w:val="ListParagraph"/>
         <w:numPr>
           <w:ilvl w:val="0"/>
-          <w:numId w:val="140"/>
+          <w:numId w:val="142"/>
         </w:numPr>
       </w:pPr>
       <w:r>
@@ -2688,7 +2728,7 @@
         <w:pStyle w:val="ListParagraph"/>
         <w:numPr>
           <w:ilvl w:val="0"/>
-          <w:numId w:val="140"/>
+          <w:numId w:val="142"/>
         </w:numPr>
       </w:pPr>
       <w:r>
@@ -2720,7 +2760,7 @@
         <w:pStyle w:val="ListParagraph"/>
         <w:numPr>
           <w:ilvl w:val="0"/>
-          <w:numId w:val="140"/>
+          <w:numId w:val="142"/>
         </w:numPr>
       </w:pPr>
       <w:r>
@@ -2752,7 +2792,7 @@
         <w:pStyle w:val="ListParagraph"/>
         <w:numPr>
           <w:ilvl w:val="0"/>
-          <w:numId w:val="140"/>
+          <w:numId w:val="142"/>
         </w:numPr>
       </w:pPr>
       <w:r>
@@ -3823,6 +3863,18 @@
     </w:lvlOverride>
   </w:num>
   <w:num w:numId="141">
+    <w:abstractNumId w:val="901"/>
+    <w:lvlOverride w:ilvl="0">
+      <w:startOverride w:val="1"/>
+    </w:lvlOverride>
+  </w:num>
+  <w:num w:numId="142">
+    <w:abstractNumId w:val="900"/>
+    <w:lvlOverride w:ilvl="0">
+      <w:startOverride w:val="1"/>
+    </w:lvlOverride>
+  </w:num>
+  <w:num w:numId="143">
     <w:abstractNumId w:val="901"/>
     <w:lvlOverride w:ilvl="0">
       <w:startOverride w:val="1"/>

</xml_diff>

<commit_message>
Docs: clarify final responses, Figure 8 timing, add Cloudflare hosting for option 1a
- Overview 5.1: one paragraph explains that responses are final for the
  participant and that only a coordinator can reopen a timepoint; the
  Figure 8 caption and labels say when the link is checked (on opening)
  versus when results are submitted. 7.3 notes the CSV needs REDCap's
  codes before import. Reviewer edits from the latest draft applied.
- Walkthrough: Section 3 covers both hosting options - Cloudflare Pages
  for in-person collection (option 1a, nothing submitted) with the
  original screenshots, and the WTS server for option 2a. The
  coordinator section is reduced to one line in 4.3.

Co-Authored-By: Claude Opus 5.5 <noreply@anthropic.com>
Claude-Session: https://claude.ai/code/session_01WvzECS9tkcDkGpWoZeB54Z
</commit_message>
<xml_diff>
--- a/docs/CTS_GitHub_Server_Walkthrough.docx
+++ b/docs/CTS_GitHub_Server_Walkthrough.docx
@@ -12,14 +12,6 @@
     </w:p>
     <w:p>
       <w:r>
-        <w:rPr>
-          <w:i/>
-        </w:rPr>
-        <w:t>Walkthrough (Ver. Oct 2026) — prepared by Jamie Kim (FHS MSK-IF)</w:t>
-      </w:r>
-    </w:p>
-    <w:p>
-      <w:r>
         <w:rPr/>
         <w:t xml:space="preserve">This document covers the setup the CTS Diagnostic Survey depends on: GitHub, which stores the code; the development workflow for changing it safely; a Western-managed (WTS) server, which replaces Cloudflare for hosting; and connecting the study's REDCap project. It is the companion to the CTS Design &amp; Workflow Overview, which explains what the application does and why the hosting must change.</w:t>
       </w:r>
@@ -27,7 +19,7 @@
     <w:p>
       <w:r>
         <w:rPr/>
-        <w:t xml:space="preserve">Sections 1 and 2 apply now. Sections 3 and 4 describe the target set-up once a WTS server is approved.</w:t>
+        <w:t xml:space="preserve">Sections 1 and 2 apply now. Section 3 covers hosting for whichever option the study chooses (Overview, Section 7): Cloudflare Pages for in-person collection (option 1a) or a WTS server for remote collection (option 2a). Section 4 applies to option 2a only.</w:t>
       </w:r>
     </w:p>
     <w:p>
@@ -35,11 +27,11 @@
         <w:rPr>
           <w:b/>
         </w:rPr>
-        <w:t xml:space="preserve">Why not Cloudflare:</w:t>
-      </w:r>
-      <w:r>
-        <w:rPr/>
-        <w:t xml:space="preserve"> a study submission is decrypted inside Cloudflare (a US company with a global network) before it reaches REDCap, which the Research Ethics Board (REB) is not expected to approve (Overview, Section 7). The public demo (standalone mode, no study data) can stay on Cloudflare Pages, but study links must use the WTS server.</w:t>
+        <w:t xml:space="preserve">Cloudflare and study data:</w:t>
+      </w:r>
+      <w:r>
+        <w:rPr/>
+        <w:t xml:space="preserve"> with remote collection through REDCap, each submission would be decrypted inside Cloudflare (a US company with a global network) before reaching REDCap, which the Research Ethics Board (REB) is not expected to approve, so option 2a uses a WTS server instead. With in-person collection (option 1a) nothing is submitted, so Cloudflare Pages can host the site (Section 3.1).</w:t>
       </w:r>
     </w:p>
     <w:p>
@@ -529,7 +521,7 @@
       </w:r>
       <w:r>
         <w:rPr/>
-        <w:t xml:space="preserve"> branch is copied too (it is ticked in the example below). Click "Create fork"</w:t>
+        <w:t xml:space="preserve"> branch is copied. Click "Create fork"</w:t>
       </w:r>
     </w:p>
     <w:p>
@@ -846,7 +838,7 @@
       </w:pPr>
       <w:r>
         <w:rPr/>
-        <w:t xml:space="preserve">Deploy the merged change to the server (Section 3.4)</w:t>
+        <w:t xml:space="preserve">Deploy the merged change: automatic on Cloudflare Pages (Section 3.1), manual on a WTS server (Section 3.2.4)</w:t>
       </w:r>
     </w:p>
     <w:p>
@@ -1027,20 +1019,594 @@
         <w:pStyle w:val="Heading2"/>
       </w:pPr>
       <w:r>
-        <w:t>3. Hosting on a Western-managed (WTS) server</w:t>
-      </w:r>
-    </w:p>
-    <w:p>
-      <w:r>
-        <w:rPr/>
-        <w:t xml:space="preserve">If the PI and research team have decided to host on WTS, proceed with this section. The website and the three REDCap functions will run together on one server inside Western, so a submission travels browser → Western server → REDCap and never passes through an external company. It corresponds to option 2a in the Overview, Section 7.</w:t>
-      </w:r>
-    </w:p>
-    <w:p>
+        <w:t>3. Hosting</w:t>
+      </w:r>
+    </w:p>
+    <w:p>
+      <w:r>
+        <w:rPr/>
+        <w:t xml:space="preserve">Follow the part that matches the option chosen in the Overview, Section 7.</w:t>
+      </w:r>
+    </w:p>
+    <w:p>
+      <w:pPr>
+        <w:pStyle w:val="Heading3"/>
+      </w:pPr>
+      <w:r>
+        <w:t>3.1 Option 1a: Cloudflare Pages (in-person collection)</w:t>
+      </w:r>
+    </w:p>
+    <w:p>
+      <w:r>
+        <w:rPr/>
+        <w:t xml:space="preserve">Participants complete the survey in person on a study device, using the plain site address (no </w:t>
+      </w:r>
+      <w:r>
+        <w:rPr>
+          <w:rFonts w:ascii="Consolas" w:hAnsi="Consolas" w:cs="Consolas"/>
+          <w:color w:val="333333"/>
+          <w:sz w:val="19"/>
+          <w:szCs w:val="19"/>
+        </w:rPr>
+        <w:t xml:space="preserve">?k=</w:t>
+      </w:r>
+      <w:r>
+        <w:rPr/>
+        <w:t xml:space="preserve"> link). The app then runs in standalone mode: answers, scores and drawings stay in the browser until they are saved to an encrypted study drive, so no study data reaches Cloudflare. Cloudflare only serves the site's files, and sees the ordinary details of those requests (such as IP address and browser type); mention this in the REB application.</w:t>
+      </w:r>
+    </w:p>
+    <w:p>
+      <w:pPr>
+        <w:pStyle w:val="Heading3"/>
+      </w:pPr>
+      <w:r>
+        <w:t>3.1.1 Prepare the option 1a version</w:t>
+      </w:r>
+    </w:p>
+    <w:p>
+      <w:r>
+        <w:rPr/>
+        <w:t xml:space="preserve">These changes are not built yet:</w:t>
+      </w:r>
+    </w:p>
+    <w:p>
+      <w:pPr>
+        <w:pStyle w:val="ListParagraph"/>
+        <w:numPr>
+          <w:ilvl w:val="0"/>
+          <w:numId w:val="121"/>
+        </w:numPr>
+      </w:pPr>
       <w:r>
         <w:rPr>
           <w:b/>
         </w:rPr>
+        <w:t xml:space="preserve">Leave out the REDCap functions.</w:t>
+      </w:r>
+      <w:r>
+        <w:rPr/>
+        <w:t xml:space="preserve"> Cloudflare Pages deploys a </w:t>
+      </w:r>
+      <w:r>
+        <w:rPr>
+          <w:rFonts w:ascii="Consolas" w:hAnsi="Consolas" w:cs="Consolas"/>
+          <w:color w:val="333333"/>
+          <w:sz w:val="19"/>
+          <w:szCs w:val="19"/>
+        </w:rPr>
+        <w:t xml:space="preserve">functions/</w:t>
+      </w:r>
+      <w:r>
+        <w:rPr/>
+        <w:t xml:space="preserve"> folder automatically as server code. Deploy from a branch without it (for example a </w:t>
+      </w:r>
+      <w:r>
+        <w:rPr>
+          <w:rFonts w:ascii="Consolas" w:hAnsi="Consolas" w:cs="Consolas"/>
+          <w:color w:val="333333"/>
+          <w:sz w:val="19"/>
+          <w:szCs w:val="19"/>
+        </w:rPr>
+        <w:t xml:space="preserve">study-in-person</w:t>
+      </w:r>
+      <w:r>
+        <w:rPr/>
+        <w:t xml:space="preserve"> branch made from </w:t>
+      </w:r>
+      <w:r>
+        <w:rPr>
+          <w:rFonts w:ascii="Consolas" w:hAnsi="Consolas" w:cs="Consolas"/>
+          <w:color w:val="333333"/>
+          <w:sz w:val="19"/>
+          <w:szCs w:val="19"/>
+        </w:rPr>
+        <w:t xml:space="preserve">redcap</w:t>
+      </w:r>
+      <w:r>
+        <w:rPr/>
+        <w:t xml:space="preserve">), so only the static site is published</w:t>
+      </w:r>
+    </w:p>
+    <w:p>
+      <w:pPr>
+        <w:pStyle w:val="ListParagraph"/>
+        <w:numPr>
+          <w:ilvl w:val="0"/>
+          <w:numId w:val="121"/>
+        </w:numPr>
+      </w:pPr>
+      <w:r>
+        <w:rPr>
+          <w:b/>
+        </w:rPr>
+        <w:t xml:space="preserve">Make the results download available on the study device</w:t>
+      </w:r>
+      <w:r>
+        <w:rPr/>
+        <w:t xml:space="preserve">, and include the four hand drawings with the answers (for example one ZIP file). The CSV download is currently shown in the healthcare professional view only (PI decision), so revisit that for in-person use</w:t>
+      </w:r>
+    </w:p>
+    <w:p>
+      <w:pPr>
+        <w:pStyle w:val="ListParagraph"/>
+        <w:numPr>
+          <w:ilvl w:val="0"/>
+          <w:numId w:val="121"/>
+        </w:numPr>
+      </w:pPr>
+      <w:r>
+        <w:rPr>
+          <w:b/>
+        </w:rPr>
+        <w:t xml:space="preserve">Use REDCap's codes in the download</w:t>
+      </w:r>
+      <w:r>
+        <w:rPr/>
+        <w:t xml:space="preserve"> (Yes = 1, No = 0 and so on, as the server does), so the files can be imported into REDCap with the Data Import Tool</w:t>
+      </w:r>
+    </w:p>
+    <w:p>
+      <w:pPr>
+        <w:pStyle w:val="ListParagraph"/>
+        <w:numPr>
+          <w:ilvl w:val="0"/>
+          <w:numId w:val="121"/>
+        </w:numPr>
+      </w:pPr>
+      <w:r>
+        <w:rPr>
+          <w:b/>
+        </w:rPr>
+        <w:t xml:space="preserve">Agree a file-naming routine</w:t>
+      </w:r>
+      <w:r>
+        <w:rPr/>
+        <w:t xml:space="preserve"> that includes the participant ID and timepoint</w:t>
+      </w:r>
+    </w:p>
+    <w:p>
+      <w:pPr>
+        <w:pStyle w:val="Heading3"/>
+      </w:pPr>
+      <w:r>
+        <w:t>3.1.2 Create a Cloudflare account</w:t>
+      </w:r>
+    </w:p>
+    <w:p>
+      <w:r>
+        <w:rPr/>
+        <w:t xml:space="preserve">Go to </w:t>
+      </w:r>
+      <w:hyperlink r:id="rId14" w:history="1">
+        <w:r>
+          <w:rPr>
+            <w:rStyle w:val="Hyperlink"/>
+          </w:rPr>
+          <w:t xml:space="preserve">https://dash.cloudflare.com/sign-up</w:t>
+        </w:r>
+      </w:hyperlink>
+      <w:r>
+        <w:rPr/>
+        <w:t xml:space="preserve"> to sign up. Use the lab's shared email or another appropriate one (for example the coordinator's or maintainer's), so the account survives staff turnover. Use a strong password and enable 2FA. The free plan is sufficient for hosting a static website.</w:t>
+      </w:r>
+    </w:p>
+    <w:p>
+      <w:pPr>
+        <w:pStyle w:val="Heading3"/>
+      </w:pPr>
+      <w:r>
+        <w:t>3.1.3 Connect GitHub to Cloudflare Pages and deploy</w:t>
+      </w:r>
+    </w:p>
+    <w:p>
+      <w:r>
+        <w:rPr/>
+        <w:t xml:space="preserve">Once configured, every change pushed to the production branch rebuilds and redeploys the website automatically.</w:t>
+      </w:r>
+    </w:p>
+    <w:p>
+      <w:pPr>
+        <w:pStyle w:val="ListParagraph"/>
+        <w:numPr>
+          <w:ilvl w:val="0"/>
+          <w:numId w:val="123"/>
+        </w:numPr>
+      </w:pPr>
+      <w:r>
+        <w:rPr/>
+        <w:t xml:space="preserve">In the Cloudflare dashboard, click "Workers &amp; Pages" in the left sidebar</w:t>
+      </w:r>
+    </w:p>
+    <w:p>
+      <w:pPr>
+        <w:pStyle w:val="ListParagraph"/>
+        <w:numPr>
+          <w:ilvl w:val="0"/>
+          <w:numId w:val="123"/>
+        </w:numPr>
+      </w:pPr>
+      <w:r>
+        <w:rPr/>
+        <w:t xml:space="preserve">Click "Create application" on the top right</w:t>
+      </w:r>
+    </w:p>
+    <w:p>
+      <w:pPr>
+        <w:pStyle w:val="ListParagraph"/>
+        <w:numPr>
+          <w:ilvl w:val="0"/>
+          <w:numId w:val="123"/>
+        </w:numPr>
+      </w:pPr>
+      <w:r>
+        <w:rPr/>
+        <w:t xml:space="preserve">Since this is a static website, click "Get started" next to "Looking to deploy Pages?" rather than creating a Worker</w:t>
+      </w:r>
+    </w:p>
+    <w:p>
+      <w:pPr>
+        <w:ind w:left="720"/>
+      </w:pPr>
+      <w:r>
+        <w:drawing>
+          <wp:inline>
+            <wp:extent cx="5257800" cy="2686708"/>
+            <wp:docPr id="2" name="Picture 2"/>
+            <wp:cNvGraphicFramePr>
+              <a:graphicFrameLocks noChangeAspect="1"/>
+            </wp:cNvGraphicFramePr>
+            <a:graphic>
+              <a:graphicData uri="http://schemas.openxmlformats.org/drawingml/2006/picture">
+                <pic:pic>
+                  <pic:nvPicPr>
+                    <pic:cNvPr id="0" name="image.png"/>
+                    <pic:cNvPicPr/>
+                  </pic:nvPicPr>
+                  <pic:blipFill>
+                    <a:blip r:embed="rId15"/>
+                    <a:stretch>
+                      <a:fillRect/>
+                    </a:stretch>
+                  </pic:blipFill>
+                  <pic:spPr>
+                    <a:xfrm>
+                      <a:off x="0" y="0"/>
+                      <a:ext cx="5257800" cy="2686708"/>
+                    </a:xfrm>
+                    <a:prstGeom prst="rect"/>
+                  </pic:spPr>
+                </pic:pic>
+              </a:graphicData>
+            </a:graphic>
+          </wp:inline>
+        </w:drawing>
+      </w:r>
+    </w:p>
+    <w:p>
+      <w:pPr>
+        <w:pStyle w:val="ListParagraph"/>
+        <w:numPr>
+          <w:ilvl w:val="0"/>
+          <w:numId w:val="123"/>
+        </w:numPr>
+      </w:pPr>
+      <w:r>
+        <w:rPr/>
+        <w:t xml:space="preserve">Proceed to "Import an existing Git repository"</w:t>
+      </w:r>
+    </w:p>
+    <w:p>
+      <w:pPr>
+        <w:ind w:left="720"/>
+      </w:pPr>
+      <w:r>
+        <w:drawing>
+          <wp:inline>
+            <wp:extent cx="5257800" cy="2523480"/>
+            <wp:docPr id="3" name="Picture 3"/>
+            <wp:cNvGraphicFramePr>
+              <a:graphicFrameLocks noChangeAspect="1"/>
+            </wp:cNvGraphicFramePr>
+            <a:graphic>
+              <a:graphicData uri="http://schemas.openxmlformats.org/drawingml/2006/picture">
+                <pic:pic>
+                  <pic:nvPicPr>
+                    <pic:cNvPr id="0" name="image.png"/>
+                    <pic:cNvPicPr/>
+                  </pic:nvPicPr>
+                  <pic:blipFill>
+                    <a:blip r:embed="rId16"/>
+                    <a:stretch>
+                      <a:fillRect/>
+                    </a:stretch>
+                  </pic:blipFill>
+                  <pic:spPr>
+                    <a:xfrm>
+                      <a:off x="0" y="0"/>
+                      <a:ext cx="5257800" cy="2523480"/>
+                    </a:xfrm>
+                    <a:prstGeom prst="rect"/>
+                  </pic:spPr>
+                </pic:pic>
+              </a:graphicData>
+            </a:graphic>
+          </wp:inline>
+        </w:drawing>
+      </w:r>
+    </w:p>
+    <w:p>
+      <w:pPr>
+        <w:pStyle w:val="ListParagraph"/>
+        <w:numPr>
+          <w:ilvl w:val="0"/>
+          <w:numId w:val="123"/>
+        </w:numPr>
+      </w:pPr>
+      <w:r>
+        <w:rPr/>
+        <w:t xml:space="preserve">Click "+ Add account"; Cloudflare will ask for access to GitHub. Choose "Only select repositories" and grant access to the lab's </w:t>
+      </w:r>
+      <w:r>
+        <w:rPr>
+          <w:rFonts w:ascii="Consolas" w:hAnsi="Consolas" w:cs="Consolas"/>
+          <w:color w:val="333333"/>
+          <w:sz w:val="19"/>
+          <w:szCs w:val="19"/>
+        </w:rPr>
+        <w:t xml:space="preserve">CTS_survey_app</w:t>
+      </w:r>
+      <w:r>
+        <w:rPr/>
+        <w:t xml:space="preserve"> fork only</w:t>
+      </w:r>
+    </w:p>
+    <w:p>
+      <w:pPr>
+        <w:ind w:left="720"/>
+      </w:pPr>
+      <w:r>
+        <w:drawing>
+          <wp:inline>
+            <wp:extent cx="5257800" cy="2084128"/>
+            <wp:docPr id="4" name="Picture 4"/>
+            <wp:cNvGraphicFramePr>
+              <a:graphicFrameLocks noChangeAspect="1"/>
+            </wp:cNvGraphicFramePr>
+            <a:graphic>
+              <a:graphicData uri="http://schemas.openxmlformats.org/drawingml/2006/picture">
+                <pic:pic>
+                  <pic:nvPicPr>
+                    <pic:cNvPr id="0" name="image.png"/>
+                    <pic:cNvPicPr/>
+                  </pic:nvPicPr>
+                  <pic:blipFill>
+                    <a:blip r:embed="rId17"/>
+                    <a:stretch>
+                      <a:fillRect/>
+                    </a:stretch>
+                  </pic:blipFill>
+                  <pic:spPr>
+                    <a:xfrm>
+                      <a:off x="0" y="0"/>
+                      <a:ext cx="5257800" cy="2084128"/>
+                    </a:xfrm>
+                    <a:prstGeom prst="rect"/>
+                  </pic:spPr>
+                </pic:pic>
+              </a:graphicData>
+            </a:graphic>
+          </wp:inline>
+        </w:drawing>
+      </w:r>
+    </w:p>
+    <w:p>
+      <w:pPr>
+        <w:pStyle w:val="ListParagraph"/>
+        <w:numPr>
+          <w:ilvl w:val="0"/>
+          <w:numId w:val="123"/>
+        </w:numPr>
+      </w:pPr>
+      <w:r>
+        <w:rPr/>
+        <w:t xml:space="preserve">Once the repository has been selected, return to Cloudflare and click "Begin setup"</w:t>
+      </w:r>
+    </w:p>
+    <w:p>
+      <w:pPr>
+        <w:pStyle w:val="ListParagraph"/>
+        <w:numPr>
+          <w:ilvl w:val="0"/>
+          <w:numId w:val="123"/>
+        </w:numPr>
+      </w:pPr>
+      <w:r>
+        <w:rPr/>
+        <w:t xml:space="preserve">Configure the build settings and deploy (leave anything not listed blank):</w:t>
+      </w:r>
+    </w:p>
+    <w:p>
+      <w:pPr>
+        <w:pStyle w:val="ListParagraph"/>
+        <w:numPr>
+          <w:ilvl w:val="1"/>
+          <w:numId w:val="122"/>
+        </w:numPr>
+      </w:pPr>
+      <w:r>
+        <w:rPr/>
+        <w:t xml:space="preserve">Project name: can be the same as the repository name; it becomes part of the URL (ProjectName.pages.dev)</w:t>
+      </w:r>
+    </w:p>
+    <w:p>
+      <w:pPr>
+        <w:pStyle w:val="ListParagraph"/>
+        <w:numPr>
+          <w:ilvl w:val="1"/>
+          <w:numId w:val="122"/>
+        </w:numPr>
+      </w:pPr>
+      <w:r>
+        <w:rPr/>
+        <w:t xml:space="preserve">Production branch: the option 1a branch (Section 3.1.1)</w:t>
+      </w:r>
+    </w:p>
+    <w:p>
+      <w:pPr>
+        <w:pStyle w:val="ListParagraph"/>
+        <w:numPr>
+          <w:ilvl w:val="1"/>
+          <w:numId w:val="122"/>
+        </w:numPr>
+      </w:pPr>
+      <w:r>
+        <w:rPr/>
+        <w:t xml:space="preserve">Framework preset: Next.js (Static HTML Export)</w:t>
+      </w:r>
+    </w:p>
+    <w:p>
+      <w:pPr>
+        <w:pStyle w:val="ListParagraph"/>
+        <w:numPr>
+          <w:ilvl w:val="1"/>
+          <w:numId w:val="122"/>
+        </w:numPr>
+      </w:pPr>
+      <w:r>
+        <w:rPr/>
+        <w:t xml:space="preserve">Build command: </w:t>
+      </w:r>
+      <w:r>
+        <w:rPr>
+          <w:rFonts w:ascii="Consolas" w:hAnsi="Consolas" w:cs="Consolas"/>
+          <w:color w:val="333333"/>
+          <w:sz w:val="19"/>
+          <w:szCs w:val="19"/>
+        </w:rPr>
+        <w:t xml:space="preserve">npm run build</w:t>
+      </w:r>
+    </w:p>
+    <w:p>
+      <w:pPr>
+        <w:pStyle w:val="ListParagraph"/>
+        <w:numPr>
+          <w:ilvl w:val="1"/>
+          <w:numId w:val="122"/>
+        </w:numPr>
+      </w:pPr>
+      <w:r>
+        <w:rPr/>
+        <w:t xml:space="preserve">Build output directory: </w:t>
+      </w:r>
+      <w:r>
+        <w:rPr>
+          <w:rFonts w:ascii="Consolas" w:hAnsi="Consolas" w:cs="Consolas"/>
+          <w:color w:val="333333"/>
+          <w:sz w:val="19"/>
+          <w:szCs w:val="19"/>
+        </w:rPr>
+        <w:t xml:space="preserve">out</w:t>
+      </w:r>
+    </w:p>
+    <w:p>
+      <w:pPr>
+        <w:pStyle w:val="ListParagraph"/>
+        <w:numPr>
+          <w:ilvl w:val="1"/>
+          <w:numId w:val="122"/>
+        </w:numPr>
+      </w:pPr>
+      <w:r>
+        <w:rPr/>
+        <w:t xml:space="preserve">Environment variable: </w:t>
+      </w:r>
+      <w:r>
+        <w:rPr>
+          <w:rFonts w:ascii="Consolas" w:hAnsi="Consolas" w:cs="Consolas"/>
+          <w:color w:val="333333"/>
+          <w:sz w:val="19"/>
+          <w:szCs w:val="19"/>
+        </w:rPr>
+        <w:t xml:space="preserve">NODE_VERSION</w:t>
+      </w:r>
+      <w:r>
+        <w:rPr/>
+        <w:t xml:space="preserve"> = </w:t>
+      </w:r>
+      <w:r>
+        <w:rPr>
+          <w:rFonts w:ascii="Consolas" w:hAnsi="Consolas" w:cs="Consolas"/>
+          <w:color w:val="333333"/>
+          <w:sz w:val="19"/>
+          <w:szCs w:val="19"/>
+        </w:rPr>
+        <w:t xml:space="preserve">20</w:t>
+      </w:r>
+    </w:p>
+    <w:p>
+      <w:pPr>
+        <w:pStyle w:val="ListParagraph"/>
+        <w:numPr>
+          <w:ilvl w:val="0"/>
+          <w:numId w:val="123"/>
+        </w:numPr>
+      </w:pPr>
+      <w:r>
+        <w:rPr/>
+        <w:t xml:space="preserve">Wait for the build to complete, open the URL Cloudflare shows, and check that the survey loads and the results download works</w:t>
+      </w:r>
+    </w:p>
+    <w:p>
+      <w:r>
+        <w:rPr>
+          <w:b/>
+        </w:rPr>
+        <w:t xml:space="preserve">Note:</w:t>
+      </w:r>
+      <w:r>
+        <w:rPr/>
+        <w:t xml:space="preserve"> option 1a needs no secrets, because nothing is sent to REDCap. Branches other than the production branch get their own preview URL, which is useful for checking a change before merging it.</w:t>
+      </w:r>
+    </w:p>
+    <w:p>
+      <w:pPr>
+        <w:pStyle w:val="Heading3"/>
+      </w:pPr>
+      <w:r>
+        <w:t>3.2 Option 2a: Western-managed (WTS) server (remote collection)</w:t>
+      </w:r>
+    </w:p>
+    <w:p>
+      <w:r>
+        <w:rPr/>
+        <w:t xml:space="preserve">The website and the three REDCap functions run together on one server inside Western, so a submission travels browser → Western server → REDCap and never passes through an external company.</w:t>
+      </w:r>
+    </w:p>
+    <w:p>
+      <w:r>
+        <w:rPr>
+          <w:b/>
+        </w:rPr>
         <w:t xml:space="preserve">Draft:</w:t>
       </w:r>
       <w:r>
@@ -1053,7 +1619,7 @@
         <w:pStyle w:val="Heading3"/>
       </w:pPr>
       <w:r>
-        <w:t>3.1 Request the server</w:t>
+        <w:t>3.2.1 Request the server</w:t>
       </w:r>
     </w:p>
     <w:p>
@@ -1061,7 +1627,7 @@
         <w:rPr/>
         <w:t xml:space="preserve">WTS lists these rates on its </w:t>
       </w:r>
-      <w:hyperlink r:id="rId14" w:history="1">
+      <w:hyperlink r:id="rId18" w:history="1">
         <w:r>
           <w:rPr>
             <w:rStyle w:val="Hyperlink"/>
@@ -1079,7 +1645,7 @@
         <w:pStyle w:val="ListParagraph"/>
         <w:numPr>
           <w:ilvl w:val="0"/>
-          <w:numId w:val="120"/>
+          <w:numId w:val="124"/>
         </w:numPr>
       </w:pPr>
       <w:r>
@@ -1098,7 +1664,7 @@
         <w:pStyle w:val="ListParagraph"/>
         <w:numPr>
           <w:ilvl w:val="0"/>
-          <w:numId w:val="120"/>
+          <w:numId w:val="124"/>
         </w:numPr>
       </w:pPr>
       <w:r>
@@ -1125,19 +1691,9 @@
       </w:r>
       <w:r>
         <w:rPr/>
-        <w:t xml:space="preserve">. The page does not state the billing period; the </w:t>
-      </w:r>
-      <w:r>
-        <w:rPr>
-          <w:i/>
-        </w:rPr>
-        <w:t xml:space="preserve">Data Residency Decision Review</w:t>
-      </w:r>
-      <w:r>
-        <w:rPr/>
-        <w:t xml:space="preserve"> treats it as monthly, and WTS's </w:t>
-      </w:r>
-      <w:hyperlink r:id="rId15" w:history="1">
+        <w:t xml:space="preserve">. The page does not state the billing period; WTS's </w:t>
+      </w:r>
+      <w:hyperlink r:id="rId19" w:history="1">
         <w:r>
           <w:rPr>
             <w:rStyle w:val="Hyperlink"/>
@@ -1161,7 +1717,7 @@
         <w:pStyle w:val="ListParagraph"/>
         <w:numPr>
           <w:ilvl w:val="0"/>
-          <w:numId w:val="122"/>
+          <w:numId w:val="126"/>
         </w:numPr>
       </w:pPr>
       <w:r>
@@ -1180,14 +1736,14 @@
         <w:pStyle w:val="ListParagraph"/>
         <w:numPr>
           <w:ilvl w:val="0"/>
-          <w:numId w:val="122"/>
+          <w:numId w:val="126"/>
         </w:numPr>
       </w:pPr>
       <w:r>
         <w:rPr>
           <w:b/>
         </w:rPr>
-        <w:t xml:space="preserve">Updating the app (Section 3.4):</w:t>
+        <w:t xml:space="preserve">Updating the app (Section 3.2.4):</w:t>
       </w:r>
       <w:r>
         <w:rPr/>
@@ -1225,7 +1781,7 @@
         <w:pStyle w:val="ListParagraph"/>
         <w:numPr>
           <w:ilvl w:val="0"/>
-          <w:numId w:val="122"/>
+          <w:numId w:val="126"/>
         </w:numPr>
       </w:pPr>
       <w:r>
@@ -1250,7 +1806,7 @@
         <w:pStyle w:val="ListParagraph"/>
         <w:numPr>
           <w:ilvl w:val="0"/>
-          <w:numId w:val="124"/>
+          <w:numId w:val="128"/>
         </w:numPr>
       </w:pPr>
       <w:r>
@@ -1269,7 +1825,7 @@
         <w:pStyle w:val="ListParagraph"/>
         <w:numPr>
           <w:ilvl w:val="0"/>
-          <w:numId w:val="124"/>
+          <w:numId w:val="128"/>
         </w:numPr>
       </w:pPr>
       <w:r>
@@ -1288,7 +1844,7 @@
         <w:pStyle w:val="ListParagraph"/>
         <w:numPr>
           <w:ilvl w:val="0"/>
-          <w:numId w:val="124"/>
+          <w:numId w:val="128"/>
         </w:numPr>
       </w:pPr>
       <w:r>
@@ -1307,7 +1863,7 @@
         <w:pStyle w:val="ListParagraph"/>
         <w:numPr>
           <w:ilvl w:val="0"/>
-          <w:numId w:val="124"/>
+          <w:numId w:val="128"/>
         </w:numPr>
       </w:pPr>
       <w:r>
@@ -1332,7 +1888,7 @@
         <w:pStyle w:val="ListParagraph"/>
         <w:numPr>
           <w:ilvl w:val="0"/>
-          <w:numId w:val="126"/>
+          <w:numId w:val="130"/>
         </w:numPr>
       </w:pPr>
       <w:r>
@@ -1351,7 +1907,7 @@
         <w:pStyle w:val="ListParagraph"/>
         <w:numPr>
           <w:ilvl w:val="0"/>
-          <w:numId w:val="126"/>
+          <w:numId w:val="130"/>
         </w:numPr>
       </w:pPr>
       <w:r>
@@ -1370,7 +1926,7 @@
         <w:pStyle w:val="ListParagraph"/>
         <w:numPr>
           <w:ilvl w:val="0"/>
-          <w:numId w:val="126"/>
+          <w:numId w:val="130"/>
         </w:numPr>
       </w:pPr>
       <w:r>
@@ -1405,7 +1961,7 @@
         <w:pStyle w:val="ListParagraph"/>
         <w:numPr>
           <w:ilvl w:val="0"/>
-          <w:numId w:val="128"/>
+          <w:numId w:val="132"/>
         </w:numPr>
       </w:pPr>
       <w:r>
@@ -1424,7 +1980,7 @@
         <w:pStyle w:val="ListParagraph"/>
         <w:numPr>
           <w:ilvl w:val="0"/>
-          <w:numId w:val="128"/>
+          <w:numId w:val="132"/>
         </w:numPr>
       </w:pPr>
       <w:r>
@@ -1466,7 +2022,7 @@
         <w:pStyle w:val="ListParagraph"/>
         <w:numPr>
           <w:ilvl w:val="0"/>
-          <w:numId w:val="128"/>
+          <w:numId w:val="132"/>
         </w:numPr>
       </w:pPr>
       <w:r>
@@ -1485,7 +2041,7 @@
         <w:pStyle w:val="ListParagraph"/>
         <w:numPr>
           <w:ilvl w:val="0"/>
-          <w:numId w:val="128"/>
+          <w:numId w:val="132"/>
         </w:numPr>
       </w:pPr>
       <w:r>
@@ -1504,7 +2060,7 @@
         <w:pStyle w:val="ListParagraph"/>
         <w:numPr>
           <w:ilvl w:val="0"/>
-          <w:numId w:val="128"/>
+          <w:numId w:val="132"/>
         </w:numPr>
       </w:pPr>
       <w:r>
@@ -1523,7 +2079,7 @@
         <w:pStyle w:val="ListParagraph"/>
         <w:numPr>
           <w:ilvl w:val="0"/>
-          <w:numId w:val="128"/>
+          <w:numId w:val="132"/>
         </w:numPr>
       </w:pPr>
       <w:r>
@@ -1555,7 +2111,7 @@
         <w:pStyle w:val="ListParagraph"/>
         <w:numPr>
           <w:ilvl w:val="0"/>
-          <w:numId w:val="128"/>
+          <w:numId w:val="132"/>
         </w:numPr>
       </w:pPr>
       <w:r>
@@ -1574,7 +2130,7 @@
         <w:pStyle w:val="Heading3"/>
       </w:pPr>
       <w:r>
-        <w:t>3.2 Code changes before deploying</w:t>
+        <w:t>3.2.2 Code changes before deploying</w:t>
       </w:r>
     </w:p>
     <w:p>
@@ -1601,7 +2157,7 @@
         <w:pStyle w:val="ListParagraph"/>
         <w:numPr>
           <w:ilvl w:val="0"/>
-          <w:numId w:val="131"/>
+          <w:numId w:val="135"/>
         </w:numPr>
       </w:pPr>
       <w:r>
@@ -1698,7 +2254,7 @@
         <w:pStyle w:val="ListParagraph"/>
         <w:numPr>
           <w:ilvl w:val="0"/>
-          <w:numId w:val="131"/>
+          <w:numId w:val="135"/>
         </w:numPr>
       </w:pPr>
       <w:r>
@@ -1730,7 +2286,7 @@
         <w:pStyle w:val="ListParagraph"/>
         <w:numPr>
           <w:ilvl w:val="0"/>
-          <w:numId w:val="131"/>
+          <w:numId w:val="135"/>
         </w:numPr>
       </w:pPr>
       <w:r>
@@ -1775,7 +2331,7 @@
         <w:pStyle w:val="ListParagraph"/>
         <w:numPr>
           <w:ilvl w:val="0"/>
-          <w:numId w:val="131"/>
+          <w:numId w:val="135"/>
         </w:numPr>
       </w:pPr>
       <w:r>
@@ -1801,15 +2357,15 @@
         <w:pStyle w:val="Heading3"/>
       </w:pPr>
       <w:r>
-        <w:t>3.3 Install on the server</w:t>
-      </w:r>
-    </w:p>
-    <w:p>
-      <w:pPr>
-        <w:pStyle w:val="ListParagraph"/>
-        <w:numPr>
-          <w:ilvl w:val="0"/>
-          <w:numId w:val="133"/>
+        <w:t>3.2.3 Install on the server</w:t>
+      </w:r>
+    </w:p>
+    <w:p>
+      <w:pPr>
+        <w:pStyle w:val="ListParagraph"/>
+        <w:numPr>
+          <w:ilvl w:val="0"/>
+          <w:numId w:val="137"/>
         </w:numPr>
       </w:pPr>
       <w:r>
@@ -1822,7 +2378,7 @@
         <w:pStyle w:val="ListParagraph"/>
         <w:numPr>
           <w:ilvl w:val="0"/>
-          <w:numId w:val="133"/>
+          <w:numId w:val="137"/>
         </w:numPr>
       </w:pPr>
       <w:r>
@@ -1848,7 +2404,7 @@
         <w:pStyle w:val="ListParagraph"/>
         <w:numPr>
           <w:ilvl w:val="0"/>
-          <w:numId w:val="133"/>
+          <w:numId w:val="137"/>
         </w:numPr>
       </w:pPr>
       <w:r>
@@ -1883,7 +2439,7 @@
         <w:pStyle w:val="ListParagraph"/>
         <w:numPr>
           <w:ilvl w:val="0"/>
-          <w:numId w:val="133"/>
+          <w:numId w:val="137"/>
         </w:numPr>
       </w:pPr>
       <w:r>
@@ -1922,7 +2478,7 @@
         <w:pStyle w:val="ListParagraph"/>
         <w:numPr>
           <w:ilvl w:val="0"/>
-          <w:numId w:val="133"/>
+          <w:numId w:val="137"/>
         </w:numPr>
       </w:pPr>
       <w:r>
@@ -1935,7 +2491,7 @@
         <w:pStyle w:val="ListParagraph"/>
         <w:numPr>
           <w:ilvl w:val="0"/>
-          <w:numId w:val="133"/>
+          <w:numId w:val="137"/>
         </w:numPr>
       </w:pPr>
       <w:r>
@@ -2004,7 +2560,7 @@
         <w:pStyle w:val="Heading3"/>
       </w:pPr>
       <w:r>
-        <w:t>3.4 Deploy updates</w:t>
+        <w:t>3.2.4 Deploy updates</w:t>
       </w:r>
     </w:p>
     <w:p>
@@ -2049,7 +2605,7 @@
         <w:pStyle w:val="Heading3"/>
       </w:pPr>
       <w:r>
-        <w:t>3.5 Retire the Cloudflare set-up</w:t>
+        <w:t>3.2.5 Retire the Cloudflare set-up</w:t>
       </w:r>
     </w:p>
     <w:p>
@@ -2063,7 +2619,7 @@
         <w:pStyle w:val="Heading2"/>
       </w:pPr>
       <w:r>
-        <w:t>4. Connecting the study's REDCap project</w:t>
+        <w:t>4. Connecting the study's REDCap project (option 2a)</w:t>
       </w:r>
     </w:p>
     <w:p>
@@ -2085,7 +2641,7 @@
         <w:pStyle w:val="ListParagraph"/>
         <w:numPr>
           <w:ilvl w:val="0"/>
-          <w:numId w:val="134"/>
+          <w:numId w:val="138"/>
         </w:numPr>
       </w:pPr>
       <w:r>
@@ -2118,7 +2674,7 @@
         <w:pStyle w:val="ListParagraph"/>
         <w:numPr>
           <w:ilvl w:val="0"/>
-          <w:numId w:val="134"/>
+          <w:numId w:val="138"/>
         </w:numPr>
       </w:pPr>
       <w:r>
@@ -2131,7 +2687,7 @@
         <w:pStyle w:val="ListParagraph"/>
         <w:numPr>
           <w:ilvl w:val="0"/>
-          <w:numId w:val="134"/>
+          <w:numId w:val="138"/>
         </w:numPr>
       </w:pPr>
       <w:r>
@@ -2158,7 +2714,7 @@
         <w:pStyle w:val="ListParagraph"/>
         <w:numPr>
           <w:ilvl w:val="0"/>
-          <w:numId w:val="136"/>
+          <w:numId w:val="140"/>
         </w:numPr>
       </w:pPr>
       <w:r>
@@ -2212,7 +2768,7 @@
         <w:pStyle w:val="ListParagraph"/>
         <w:numPr>
           <w:ilvl w:val="0"/>
-          <w:numId w:val="136"/>
+          <w:numId w:val="140"/>
         </w:numPr>
       </w:pPr>
       <w:r>
@@ -2344,7 +2900,7 @@
         <w:pStyle w:val="ListParagraph"/>
         <w:numPr>
           <w:ilvl w:val="0"/>
-          <w:numId w:val="136"/>
+          <w:numId w:val="140"/>
         </w:numPr>
       </w:pPr>
       <w:r>
@@ -2363,7 +2919,7 @@
         <w:pStyle w:val="ListParagraph"/>
         <w:numPr>
           <w:ilvl w:val="0"/>
-          <w:numId w:val="136"/>
+          <w:numId w:val="140"/>
         </w:numPr>
       </w:pPr>
       <w:r>
@@ -2391,7 +2947,7 @@
         <w:pStyle w:val="ListParagraph"/>
         <w:numPr>
           <w:ilvl w:val="0"/>
-          <w:numId w:val="136"/>
+          <w:numId w:val="140"/>
         </w:numPr>
       </w:pPr>
       <w:r>
@@ -2419,7 +2975,7 @@
         <w:pStyle w:val="ListParagraph"/>
         <w:numPr>
           <w:ilvl w:val="0"/>
-          <w:numId w:val="136"/>
+          <w:numId w:val="140"/>
         </w:numPr>
       </w:pPr>
       <w:r>
@@ -2449,15 +3005,15 @@
     <w:p>
       <w:r>
         <w:rPr/>
-        <w:t xml:space="preserve">The server needs these secrets (Section 3.3):</w:t>
-      </w:r>
-    </w:p>
-    <w:p>
-      <w:pPr>
-        <w:pStyle w:val="ListParagraph"/>
-        <w:numPr>
-          <w:ilvl w:val="0"/>
-          <w:numId w:val="138"/>
+        <w:t xml:space="preserve">The server needs these secrets (Section 3.2.3):</w:t>
+      </w:r>
+    </w:p>
+    <w:p>
+      <w:pPr>
+        <w:pStyle w:val="ListParagraph"/>
+        <w:numPr>
+          <w:ilvl w:val="0"/>
+          <w:numId w:val="142"/>
         </w:numPr>
       </w:pPr>
       <w:r>
@@ -2479,7 +3035,7 @@
         <w:pStyle w:val="ListParagraph"/>
         <w:numPr>
           <w:ilvl w:val="0"/>
-          <w:numId w:val="138"/>
+          <w:numId w:val="142"/>
         </w:numPr>
       </w:pPr>
       <w:r>
@@ -2501,7 +3057,7 @@
         <w:pStyle w:val="ListParagraph"/>
         <w:numPr>
           <w:ilvl w:val="0"/>
-          <w:numId w:val="138"/>
+          <w:numId w:val="142"/>
         </w:numPr>
       </w:pPr>
       <w:r>
@@ -2523,7 +3079,7 @@
         <w:pStyle w:val="ListParagraph"/>
         <w:numPr>
           <w:ilvl w:val="0"/>
-          <w:numId w:val="138"/>
+          <w:numId w:val="142"/>
         </w:numPr>
       </w:pPr>
       <w:r>
@@ -2558,7 +3114,7 @@
         <w:pStyle w:val="ListParagraph"/>
         <w:numPr>
           <w:ilvl w:val="0"/>
-          <w:numId w:val="138"/>
+          <w:numId w:val="142"/>
         </w:numPr>
       </w:pPr>
       <w:r>
@@ -2580,7 +3136,7 @@
         <w:pStyle w:val="ListParagraph"/>
         <w:numPr>
           <w:ilvl w:val="0"/>
-          <w:numId w:val="138"/>
+          <w:numId w:val="142"/>
         </w:numPr>
       </w:pPr>
       <w:r>
@@ -2636,7 +3192,7 @@
         <w:pStyle w:val="ListParagraph"/>
         <w:numPr>
           <w:ilvl w:val="0"/>
-          <w:numId w:val="141"/>
+          <w:numId w:val="145"/>
         </w:numPr>
       </w:pPr>
       <w:r>
@@ -2662,7 +3218,7 @@
         <w:pStyle w:val="ListParagraph"/>
         <w:numPr>
           <w:ilvl w:val="0"/>
-          <w:numId w:val="141"/>
+          <w:numId w:val="145"/>
         </w:numPr>
       </w:pPr>
       <w:r>
@@ -2688,7 +3244,7 @@
         <w:pStyle w:val="ListParagraph"/>
         <w:numPr>
           <w:ilvl w:val="0"/>
-          <w:numId w:val="141"/>
+          <w:numId w:val="145"/>
         </w:numPr>
       </w:pPr>
       <w:r>
@@ -2701,7 +3257,7 @@
         <w:pStyle w:val="ListParagraph"/>
         <w:numPr>
           <w:ilvl w:val="0"/>
-          <w:numId w:val="141"/>
+          <w:numId w:val="145"/>
         </w:numPr>
       </w:pPr>
       <w:r>
@@ -2714,7 +3270,7 @@
         <w:pStyle w:val="ListParagraph"/>
         <w:numPr>
           <w:ilvl w:val="0"/>
-          <w:numId w:val="141"/>
+          <w:numId w:val="145"/>
         </w:numPr>
       </w:pPr>
       <w:r>
@@ -2723,30 +3279,9 @@
       </w:r>
     </w:p>
     <w:p>
-      <w:pPr>
-        <w:pStyle w:val="Heading3"/>
-      </w:pPr>
-      <w:r>
-        <w:t>4.4 Coordinator procedures</w:t>
-      </w:r>
-    </w:p>
-    <w:p>
-      <w:pPr>
-        <w:pStyle w:val="ListParagraph"/>
-        <w:numPr>
-          <w:ilvl w:val="0"/>
-          <w:numId w:val="142"/>
-        </w:numPr>
-      </w:pPr>
-      <w:r>
-        <w:rPr>
-          <w:b/>
-        </w:rPr>
-        <w:t xml:space="preserve">When a timepoint closes:</w:t>
-      </w:r>
-      <w:r>
-        <w:rPr/>
-        <w:t xml:space="preserve"> </w:t>
+      <w:r>
+        <w:rPr/>
+        <w:t xml:space="preserve">To let a participant redo a timepoint, clear that event's </w:t>
       </w:r>
       <w:r>
         <w:rPr>
@@ -2759,103 +3294,7 @@
       </w:r>
       <w:r>
         <w:rPr/>
-        <w:t xml:space="preserve"> is filled when the answers are submitted on reaching the Results page, not when the link is opened. A participant who opens a link and leaves without finishing can come back later</w:t>
-      </w:r>
-    </w:p>
-    <w:p>
-      <w:pPr>
-        <w:pStyle w:val="ListParagraph"/>
-        <w:numPr>
-          <w:ilvl w:val="0"/>
-          <w:numId w:val="142"/>
-        </w:numPr>
-      </w:pPr>
-      <w:r>
-        <w:rPr>
-          <w:b/>
-        </w:rPr>
-        <w:t xml:space="preserve">Let a participant redo the survey for a specific timepoint:</w:t>
-      </w:r>
-      <w:r>
-        <w:rPr/>
-        <w:t xml:space="preserve"> clear that event's </w:t>
-      </w:r>
-      <w:r>
-        <w:rPr>
-          <w:rFonts w:ascii="Consolas" w:hAnsi="Consolas" w:cs="Consolas"/>
-          <w:color w:val="333333"/>
-          <w:sz w:val="19"/>
-          <w:szCs w:val="19"/>
-        </w:rPr>
-        <w:t xml:space="preserve">timestamp</w:t>
-      </w:r>
-      <w:r>
-        <w:rPr/>
-        <w:t xml:space="preserve"> field (possible with data entry rights). The next submission replaces the earlier answers for that event</w:t>
-      </w:r>
-    </w:p>
-    <w:p>
-      <w:pPr>
-        <w:pStyle w:val="ListParagraph"/>
-        <w:numPr>
-          <w:ilvl w:val="0"/>
-          <w:numId w:val="142"/>
-        </w:numPr>
-      </w:pPr>
-      <w:r>
-        <w:rPr>
-          <w:b/>
-        </w:rPr>
-        <w:t xml:space="preserve">Close a timepoint without a submission:</w:t>
-      </w:r>
-      <w:r>
-        <w:rPr/>
-        <w:t xml:space="preserve"> enter a value in its </w:t>
-      </w:r>
-      <w:r>
-        <w:rPr>
-          <w:rFonts w:ascii="Consolas" w:hAnsi="Consolas" w:cs="Consolas"/>
-          <w:color w:val="333333"/>
-          <w:sz w:val="19"/>
-          <w:szCs w:val="19"/>
-        </w:rPr>
-        <w:t xml:space="preserve">timestamp</w:t>
-      </w:r>
-      <w:r>
-        <w:rPr/>
-        <w:t xml:space="preserve"> field</w:t>
-      </w:r>
-    </w:p>
-    <w:p>
-      <w:pPr>
-        <w:pStyle w:val="ListParagraph"/>
-        <w:numPr>
-          <w:ilvl w:val="0"/>
-          <w:numId w:val="142"/>
-        </w:numPr>
-      </w:pPr>
-      <w:r>
-        <w:rPr>
-          <w:b/>
-        </w:rPr>
-        <w:t xml:space="preserve">Drawings missing:</w:t>
-      </w:r>
-      <w:r>
-        <w:rPr/>
-        <w:t xml:space="preserve"> if a submission saved the answers but not all four drawings, the participant is asked to print or save the results page as a PDF and share it. With </w:t>
-      </w:r>
-      <w:r>
-        <w:rPr>
-          <w:rFonts w:ascii="Consolas" w:hAnsi="Consolas" w:cs="Consolas"/>
-          <w:color w:val="333333"/>
-          <w:sz w:val="19"/>
-          <w:szCs w:val="19"/>
-        </w:rPr>
-        <w:t xml:space="preserve">IMAGE_STATUS_FIELD</w:t>
-      </w:r>
-      <w:r>
-        <w:rPr/>
-        <w:t xml:space="preserve"> configured, a REDCap report on that field lists the affected records</w:t>
+        <w:t xml:space="preserve"> (time completed) field in REDCap; data entry rights are enough. The next submission replaces the earlier answers for that event.</w:t>
       </w:r>
     </w:p>
     <w:sectPr>
@@ -3914,6 +4353,18 @@
     </w:lvlOverride>
   </w:num>
   <w:num w:numId="143">
+    <w:abstractNumId w:val="901"/>
+    <w:lvlOverride w:ilvl="0">
+      <w:startOverride w:val="1"/>
+    </w:lvlOverride>
+  </w:num>
+  <w:num w:numId="144">
+    <w:abstractNumId w:val="900"/>
+    <w:lvlOverride w:ilvl="0">
+      <w:startOverride w:val="1"/>
+    </w:lvlOverride>
+  </w:num>
+  <w:num w:numId="145">
     <w:abstractNumId w:val="901"/>
     <w:lvlOverride w:ilvl="0">
       <w:startOverride w:val="1"/>

</xml_diff>

<commit_message>
docs: final review fixes to the overview and walkthrough
Reflect main as the option 1a version (PR #2 merged): replace the stale
merge/print-bug open item, mark 1a as built, point value coding to
lib/redcapCoding.js, note the WTS billing period is unconfirmed, add the
Cloudflare preview-branch step and the 1a REDCap import prerequisites.

Co-Authored-By: Claude Opus 5.5 <noreply@anthropic.com>
Claude-Session: https://claude.ai/code/session_01WvzECS9tkcDkGpWoZeB54Z
</commit_message>
<xml_diff>
--- a/docs/CTS_GitHub_Server_Walkthrough.docx
+++ b/docs/CTS_GitHub_Server_Walkthrough.docx
@@ -13,7 +13,7 @@
     <w:p>
       <w:r>
         <w:rPr/>
-        <w:t xml:space="preserve">This document covers the setup the CTS Diagnostic Survey depends on: GitHub, which stores the code; the development workflow for changing it safely; a Western-managed (WTS) server, which replaces Cloudflare for hosting; and connecting the study's REDCap project. It is the companion to the CTS Design &amp; Workflow Overview, which explains what the application does and why the hosting must change.</w:t>
+        <w:t xml:space="preserve">This document covers the setup the CTS Diagnostic Survey depends on: GitHub, which stores the code; the development workflow for changing it safely; hosting, on Cloudflare Pages for option 1a or a Western-managed (WTS) server for option 2a; and connecting the study's REDCap project. It is the companion to the CTS Design &amp; Workflow Overview, which explains what the application does and why the hosting must change.</w:t>
       </w:r>
     </w:p>
     <w:p>
@@ -1221,7 +1221,7 @@
     <w:p>
       <w:r>
         <w:rPr/>
-        <w:t xml:space="preserve">Later, import the CSV with REDCap's Data Import Tool and upload each drawing to its file-upload field.</w:t>
+        <w:t xml:space="preserve">Later, import the CSV with REDCap's Data Import Tool and upload each drawing to its file-upload field. The import needs the REDCap project set up as in Section 4.2 (events, fields and coded values), and has not been tested yet, so try it on a test record first.</w:t>
       </w:r>
     </w:p>
     <w:p>
@@ -1622,19 +1622,80 @@
       </w:pPr>
       <w:r>
         <w:rPr/>
-        <w:t xml:space="preserve">Wait for the build to complete, open the URL Cloudflare shows, and check that the survey loads and the results download works</w:t>
-      </w:r>
-    </w:p>
-    <w:p>
+        <w:t xml:space="preserve">Wait for the build to complete, open the URL Cloudflare shows, and check that the survey loads and </w:t>
+      </w:r>
       <w:r>
         <w:rPr>
           <w:b/>
         </w:rPr>
+        <w:t xml:space="preserve">Save study files (ZIP)</w:t>
+      </w:r>
+      <w:r>
+        <w:rPr/>
+        <w:t xml:space="preserve"> downloads</w:t>
+      </w:r>
+    </w:p>
+    <w:p>
+      <w:pPr>
+        <w:pStyle w:val="ListParagraph"/>
+        <w:numPr>
+          <w:ilvl w:val="0"/>
+          <w:numId w:val="123"/>
+        </w:numPr>
+      </w:pPr>
+      <w:r>
+        <w:rPr/>
+        <w:t xml:space="preserve">In the project's Settings, under Branch control, set preview deployments to None (or to custom branches that exclude </w:t>
+      </w:r>
+      <w:r>
+        <w:rPr>
+          <w:rFonts w:ascii="Consolas" w:hAnsi="Consolas" w:cs="Consolas"/>
+          <w:color w:val="333333"/>
+          <w:sz w:val="19"/>
+          <w:szCs w:val="19"/>
+        </w:rPr>
+        <w:t xml:space="preserve">redcap</w:t>
+      </w:r>
+      <w:r>
+        <w:rPr/>
+        <w:t xml:space="preserve">). Otherwise Cloudflare also builds the </w:t>
+      </w:r>
+      <w:r>
+        <w:rPr>
+          <w:rFonts w:ascii="Consolas" w:hAnsi="Consolas" w:cs="Consolas"/>
+          <w:color w:val="333333"/>
+          <w:sz w:val="19"/>
+          <w:szCs w:val="19"/>
+        </w:rPr>
+        <w:t xml:space="preserve">redcap</w:t>
+      </w:r>
+      <w:r>
+        <w:rPr/>
+        <w:t xml:space="preserve"> branch, whose </w:t>
+      </w:r>
+      <w:r>
+        <w:rPr>
+          <w:rFonts w:ascii="Consolas" w:hAnsi="Consolas" w:cs="Consolas"/>
+          <w:color w:val="333333"/>
+          <w:sz w:val="19"/>
+          <w:szCs w:val="19"/>
+        </w:rPr>
+        <w:t xml:space="preserve">functions/</w:t>
+      </w:r>
+      <w:r>
+        <w:rPr/>
+        <w:t xml:space="preserve"> folder would put the REDCap functions back on Cloudflare</w:t>
+      </w:r>
+    </w:p>
+    <w:p>
+      <w:r>
+        <w:rPr>
+          <w:b/>
+        </w:rPr>
         <w:t xml:space="preserve">Note:</w:t>
       </w:r>
       <w:r>
-        <w:rPr/>
-        <w:t xml:space="preserve"> option 1a needs no secrets, because nothing is sent to REDCap. Branches other than the production branch get their own preview URL, which is useful for checking a change before merging it.</w:t>
+        <w:t xml:space="preserve"> option 1a needs no secrets, because nothing is sent to REDCap.</w:t>
       </w:r>
     </w:p>
     <w:p>

</xml_diff>